<commit_message>
add compiler macro demo
</commit_message>
<xml_diff>
--- a/labs/Professional-Vue-v2.1-labs.docx
+++ b/labs/Professional-Vue-v2.1-labs.docx
@@ -203,13 +203,13 @@
       <w:pPr>
         <w:pStyle w:val="Heading1"/>
       </w:pPr>
-      <w:bookmarkStart w:id="0" w:name="_Toc503362381"/>
-      <w:bookmarkStart w:id="1" w:name="_Toc242087209"/>
+      <w:bookmarkStart w:id="0" w:name="_Toc242087209"/>
+      <w:bookmarkStart w:id="1" w:name="_Toc503362381"/>
       <w:r>
         <w:lastRenderedPageBreak/>
         <w:t>Table of Contents</w:t>
       </w:r>
-      <w:bookmarkEnd w:id="1"/>
+      <w:bookmarkEnd w:id="0"/>
     </w:p>
     <w:p>
       <w:pPr>
@@ -3145,7 +3145,7 @@
         <w:lastRenderedPageBreak/>
         <w:t>Disclaimers and Copyright Statement</w:t>
       </w:r>
-      <w:bookmarkEnd w:id="0"/>
+      <w:bookmarkEnd w:id="1"/>
       <w:bookmarkEnd w:id="2"/>
     </w:p>
     <w:p>
@@ -6731,7 +6731,19 @@
     </w:p>
     <w:p>
       <w:r>
-        <w:t>In this part, you will learn the basics of using Node.js.</w:t>
+        <w:t>In this part, you’ll spend about 20 minutes exploring Node.js from three angles: checking the installation, experimenting in the interactive shell, and running JavaScript from a file. Along the way, you’ll inspect built-in Node.js values, practice a few terminal commands, and turn a simple greeting into a small command-line program.</w:t>
+      </w:r>
+    </w:p>
+    <w:p>
+      <w:r>
+        <w:rPr>
+          <w:b/>
+          <w:bCs/>
+        </w:rPr>
+        <w:t>Estimated time:</w:t>
+      </w:r>
+      <w:r>
+        <w:t xml:space="preserve"> 20 minutes</w:t>
       </w:r>
     </w:p>
     <w:p/>
@@ -6814,26 +6826,45 @@
     <w:p>
       <w:pPr>
         <w:pStyle w:val="LabNL"/>
-        <w:numPr>
-          <w:ilvl w:val="0"/>
-          <w:numId w:val="1"/>
-        </w:numPr>
-      </w:pPr>
-      <w:r>
-        <w:t xml:space="preserve">To check whether Node.js is property installed, enter </w:t>
-      </w:r>
-      <w:r>
-        <w:rPr>
-          <w:rStyle w:val="InlineCode"/>
+      </w:pPr>
+      <w:r>
+        <w:t>Check that</w:t>
+      </w:r>
+      <w:r>
+        <w:t xml:space="preserve"> Node.js is </w:t>
+      </w:r>
+      <w:r>
+        <w:t>installed</w:t>
+      </w:r>
+      <w:r>
+        <w:t xml:space="preserve"> by entering</w:t>
+      </w:r>
+      <w:r>
+        <w:t xml:space="preserve"> </w:t>
+      </w:r>
+      <w:r>
+        <w:rPr>
+          <w:rStyle w:val="InlineCode"/>
+          <w:rFonts w:asciiTheme="minorHAnsi" w:hAnsiTheme="minorHAnsi" w:cstheme="minorBidi"/>
+          <w:sz w:val="20"/>
+          <w:szCs w:val="20"/>
         </w:rPr>
         <w:t>node -v</w:t>
       </w:r>
       <w:r>
-        <w:t xml:space="preserve"> </w:t>
-      </w:r>
-      <w:r>
-        <w:br/>
-        <w:t>You should see something like the following:</w:t>
+        <w:t xml:space="preserve">. </w:t>
+      </w:r>
+      <w:r>
+        <w:t xml:space="preserve">You should see </w:t>
+      </w:r>
+      <w:r>
+        <w:t>a version number. Compare it with</w:t>
+      </w:r>
+      <w:r>
+        <w:t xml:space="preserve"> the </w:t>
+      </w:r>
+      <w:r>
+        <w:t>version required in the setup instructions; the number doesn’t need to match the example image exactly.</w:t>
       </w:r>
     </w:p>
     <w:p>
@@ -6843,17 +6874,14 @@
     </w:p>
     <w:p>
       <w:pPr>
-        <w:pStyle w:val="LabNLCode"/>
-      </w:pPr>
-      <w:r>
-        <w:rPr>
-          <w:noProof/>
-        </w:rPr>
+        <w:pStyle w:val="Figure"/>
+      </w:pPr>
+      <w:r>
         <w:drawing>
-          <wp:inline distT="0" distB="0" distL="0" distR="0" wp14:anchorId="18E86AD2" wp14:editId="2756AEAA">
-            <wp:extent cx="4367219" cy="2320293"/>
-            <wp:effectExtent l="0" t="0" r="1905" b="3810"/>
-            <wp:docPr id="26" name="Picture 26"/>
+          <wp:inline distT="0" distB="0" distL="0" distR="0" wp14:anchorId="16E66639" wp14:editId="6B08D780">
+            <wp:extent cx="5943600" cy="3025775"/>
+            <wp:effectExtent l="0" t="0" r="0" b="0"/>
+            <wp:docPr id="1331138672" name="Picture 1"/>
             <wp:cNvGraphicFramePr>
               <a:graphicFrameLocks xmlns:a="http://schemas.openxmlformats.org/drawingml/2006/main" noChangeAspect="1"/>
             </wp:cNvGraphicFramePr>
@@ -6861,7 +6889,7 @@
               <a:graphicData uri="http://schemas.openxmlformats.org/drawingml/2006/picture">
                 <pic:pic xmlns:pic="http://schemas.openxmlformats.org/drawingml/2006/picture">
                   <pic:nvPicPr>
-                    <pic:cNvPr id="0" name="nodeversion.PNG"/>
+                    <pic:cNvPr id="1331138672" name=""/>
                     <pic:cNvPicPr/>
                   </pic:nvPicPr>
                   <pic:blipFill>
@@ -6873,7 +6901,7 @@
                   <pic:spPr>
                     <a:xfrm>
                       <a:off x="0" y="0"/>
-                      <a:ext cx="4367219" cy="2320293"/>
+                      <a:ext cx="5943600" cy="3025775"/>
                     </a:xfrm>
                     <a:prstGeom prst="rect">
                       <a:avLst/>
@@ -6888,11 +6916,75 @@
     </w:p>
     <w:p>
       <w:pPr>
-        <w:pStyle w:val="LabNL"/>
-        <w:numPr>
-          <w:ilvl w:val="0"/>
-          <w:numId w:val="1"/>
-        </w:numPr>
+        <w:pStyle w:val="LabNLSub"/>
+        <w:rPr>
+          <w:sz w:val="24"/>
+          <w:szCs w:val="24"/>
+        </w:rPr>
+      </w:pPr>
+      <w:r>
+        <w:t>If the command isn’t recognized, Node.js either isn’t installed or its installation directory isn’t on your system path. Return to the setup instructions before continuing.</w:t>
+      </w:r>
+    </w:p>
+    <w:p>
+      <w:pPr>
+        <w:pStyle w:val="LabNL"/>
+      </w:pPr>
+      <w:r>
+        <w:lastRenderedPageBreak/>
+        <w:t xml:space="preserve">Find the location of the Node.js executable. On macOS or Linux, enter </w:t>
+      </w:r>
+      <w:r>
+        <w:rPr>
+          <w:rStyle w:val="InlineCode"/>
+          <w:rFonts w:asciiTheme="minorHAnsi" w:hAnsiTheme="minorHAnsi" w:cstheme="minorBidi"/>
+          <w:sz w:val="20"/>
+          <w:szCs w:val="20"/>
+        </w:rPr>
+        <w:t>which node</w:t>
+      </w:r>
+      <w:r>
+        <w:t xml:space="preserve">. On Windows, enter </w:t>
+      </w:r>
+      <w:proofErr w:type="gramStart"/>
+      <w:r>
+        <w:rPr>
+          <w:rStyle w:val="InlineCode"/>
+          <w:rFonts w:asciiTheme="minorHAnsi" w:hAnsiTheme="minorHAnsi" w:cstheme="minorBidi"/>
+          <w:sz w:val="20"/>
+          <w:szCs w:val="20"/>
+        </w:rPr>
+        <w:t>where</w:t>
+      </w:r>
+      <w:proofErr w:type="gramEnd"/>
+      <w:r>
+        <w:rPr>
+          <w:rStyle w:val="InlineCode"/>
+          <w:rFonts w:asciiTheme="minorHAnsi" w:hAnsiTheme="minorHAnsi" w:cstheme="minorBidi"/>
+          <w:sz w:val="20"/>
+          <w:szCs w:val="20"/>
+        </w:rPr>
+        <w:t xml:space="preserve"> node</w:t>
+      </w:r>
+      <w:r>
+        <w:t>.</w:t>
+      </w:r>
+    </w:p>
+    <w:p>
+      <w:pPr>
+        <w:pStyle w:val="LabNLSub"/>
+        <w:rPr>
+          <w:sz w:val="24"/>
+          <w:szCs w:val="24"/>
+        </w:rPr>
+      </w:pPr>
+      <w:r>
+        <w:t>This command shows which Node.js installation your terminal will use. It’s especially useful when a computer has more than one version installed.</w:t>
+      </w:r>
+    </w:p>
+    <w:p>
+      <w:pPr>
+        <w:pStyle w:val="LabNL"/>
       </w:pPr>
       <w:r>
         <w:t xml:space="preserve">Enter </w:t>
@@ -6900,17 +6992,14 @@
       <w:r>
         <w:rPr>
           <w:rStyle w:val="InlineCode"/>
+          <w:rFonts w:asciiTheme="minorHAnsi" w:hAnsiTheme="minorHAnsi" w:cstheme="minorBidi"/>
+          <w:sz w:val="20"/>
+          <w:szCs w:val="20"/>
         </w:rPr>
         <w:t>node</w:t>
       </w:r>
       <w:r>
-        <w:t xml:space="preserve"> to open the interactive shell</w:t>
-      </w:r>
-      <w:r>
-        <w:t>, REPL.</w:t>
-      </w:r>
-      <w:r>
-        <w:t xml:space="preserve"> </w:t>
+        <w:t xml:space="preserve"> to open the interactive shell, called the REPL. REPL stands for Read-Eval-Print Loop: Node.js reads what you enter, evaluates it, prints the result, and then waits for the next command.</w:t>
       </w:r>
     </w:p>
     <w:p/>
@@ -6938,201 +7027,302 @@
     <w:p>
       <w:pPr>
         <w:pStyle w:val="LabNL"/>
-        <w:numPr>
-          <w:ilvl w:val="0"/>
-          <w:numId w:val="1"/>
-        </w:numPr>
+      </w:pPr>
+      <w:r>
+        <w:t>Try a few JavaScript expressions, pressing Enter after each one:</w:t>
+      </w:r>
+    </w:p>
+    <w:p>
+      <w:pPr>
+        <w:pStyle w:val="LabNLCode"/>
+        <w:rPr>
+          <w:sz w:val="24"/>
+          <w:szCs w:val="24"/>
+        </w:rPr>
+      </w:pPr>
+      <w:r>
+        <w:t>2 + 2</w:t>
+      </w:r>
+      <w:r>
+        <w:br/>
+        <w:t>['Vue', 'Node', '</w:t>
+      </w:r>
+      <w:proofErr w:type="spellStart"/>
+      <w:r>
+        <w:t>npm</w:t>
+      </w:r>
+      <w:proofErr w:type="spellEnd"/>
+      <w:r>
+        <w:t>'</w:t>
+      </w:r>
+      <w:proofErr w:type="gramStart"/>
+      <w:r>
+        <w:t>].length</w:t>
+      </w:r>
+      <w:proofErr w:type="gramEnd"/>
+      <w:r>
+        <w:br/>
+        <w:t>new Date(</w:t>
+      </w:r>
+      <w:proofErr w:type="gramStart"/>
+      <w:r>
+        <w:t>).</w:t>
+      </w:r>
+      <w:proofErr w:type="spellStart"/>
+      <w:r>
+        <w:t>toLocaleDateString</w:t>
+      </w:r>
+      <w:proofErr w:type="spellEnd"/>
+      <w:proofErr w:type="gramEnd"/>
+      <w:r>
+        <w:t>()</w:t>
+      </w:r>
+    </w:p>
+    <w:p>
+      <w:pPr>
+        <w:pStyle w:val="LabNLSub"/>
+        <w:rPr>
+          <w:sz w:val="24"/>
+          <w:szCs w:val="24"/>
+        </w:rPr>
+      </w:pPr>
+      <w:r>
+        <w:t>Before you press Enter, predict the result of each expression. The REPL is useful for testing an idea quickly without creating a file.</w:t>
+      </w:r>
+    </w:p>
+    <w:p>
+      <w:pPr>
+        <w:pStyle w:val="LabNL"/>
       </w:pPr>
       <w:r>
         <w:t xml:space="preserve">Enter </w:t>
       </w:r>
-      <w:r>
-        <w:rPr>
-          <w:rStyle w:val="InlineCode"/>
-        </w:rPr>
-        <w:t>console.log('Hello, World!'</w:t>
-      </w:r>
-      <w:r>
-        <w:rPr>
-          <w:rStyle w:val="InlineCode"/>
-        </w:rPr>
-        <w:t>);</w:t>
-      </w:r>
-      <w:r>
-        <w:t xml:space="preserve"> into the shell.</w:t>
-      </w:r>
-    </w:p>
-    <w:p>
-      <w:pPr>
-        <w:pStyle w:val="LabNLCode"/>
-      </w:pPr>
-      <w:r>
-        <w:rPr>
-          <w:noProof/>
-        </w:rPr>
+      <w:proofErr w:type="gramStart"/>
+      <w:r>
+        <w:rPr>
+          <w:rStyle w:val="InlineCode"/>
+          <w:rFonts w:asciiTheme="minorHAnsi" w:hAnsiTheme="minorHAnsi" w:cstheme="minorBidi"/>
+          <w:sz w:val="20"/>
+          <w:szCs w:val="20"/>
+        </w:rPr>
+        <w:t>console.log(</w:t>
+      </w:r>
+      <w:proofErr w:type="gramEnd"/>
+      <w:r>
+        <w:rPr>
+          <w:rStyle w:val="InlineCode"/>
+          <w:rFonts w:asciiTheme="minorHAnsi" w:hAnsiTheme="minorHAnsi" w:cstheme="minorBidi"/>
+          <w:sz w:val="20"/>
+          <w:szCs w:val="20"/>
+        </w:rPr>
+        <w:t>'Hello, World!');</w:t>
+      </w:r>
+      <w:r>
+        <w:t xml:space="preserve"> in the REPL.</w:t>
+      </w:r>
+    </w:p>
+    <w:p>
+      <w:pPr>
+        <w:pStyle w:val="Note"/>
+      </w:pPr>
+      <w:r>
+        <w:rPr>
+          <w:b/>
+        </w:rPr>
+        <w:t>Note:</w:t>
+      </w:r>
+      <w:r>
+        <w:t xml:space="preserve"> Every JavaScript statement has a return value. The default return value is </w:t>
+      </w:r>
+      <w:r>
+        <w:rPr>
+          <w:rStyle w:val="InlineCode"/>
+        </w:rPr>
+        <w:t>undefined</w:t>
+      </w:r>
+      <w:r>
+        <w:t xml:space="preserve">. So, if you execute a command that doesn't have any other return value, as in this case, node outputs </w:t>
+      </w:r>
+      <w:r>
+        <w:rPr>
+          <w:rStyle w:val="InlineCode"/>
+        </w:rPr>
+        <w:t>undefined</w:t>
+      </w:r>
+      <w:r>
+        <w:t xml:space="preserve"> after the results of running the statement.</w:t>
+      </w:r>
+    </w:p>
+    <w:p>
+      <w:pPr>
+        <w:pStyle w:val="LabNL"/>
+      </w:pPr>
+      <w:r>
+        <w:t>Explore two values that Node.js provides to every program:</w:t>
+      </w:r>
+    </w:p>
+    <w:p>
+      <w:pPr>
+        <w:pStyle w:val="LabNLCode"/>
+        <w:rPr>
+          <w:sz w:val="24"/>
+          <w:szCs w:val="24"/>
+        </w:rPr>
+      </w:pPr>
+      <w:proofErr w:type="spellStart"/>
+      <w:proofErr w:type="gramStart"/>
+      <w:r>
+        <w:t>process.version</w:t>
+      </w:r>
+      <w:proofErr w:type="spellEnd"/>
+      <w:proofErr w:type="gramEnd"/>
+      <w:r>
+        <w:br/>
+      </w:r>
+      <w:proofErr w:type="spellStart"/>
+      <w:proofErr w:type="gramStart"/>
+      <w:r>
+        <w:t>process.platform</w:t>
+      </w:r>
+      <w:proofErr w:type="spellEnd"/>
+      <w:proofErr w:type="gramEnd"/>
+    </w:p>
+    <w:p>
+      <w:pPr>
+        <w:pStyle w:val="LabNLSub"/>
+        <w:rPr>
+          <w:sz w:val="24"/>
+          <w:szCs w:val="24"/>
+        </w:rPr>
+      </w:pPr>
+      <w:proofErr w:type="spellStart"/>
+      <w:proofErr w:type="gramStart"/>
+      <w:r>
+        <w:rPr>
+          <w:rStyle w:val="InlineCode"/>
+        </w:rPr>
+        <w:t>process.version</w:t>
+      </w:r>
+      <w:proofErr w:type="spellEnd"/>
+      <w:proofErr w:type="gramEnd"/>
+      <w:r>
+        <w:t xml:space="preserve"> reports the running Node.js version, and </w:t>
+      </w:r>
+      <w:proofErr w:type="spellStart"/>
+      <w:proofErr w:type="gramStart"/>
+      <w:r>
+        <w:rPr>
+          <w:rStyle w:val="InlineCode"/>
+        </w:rPr>
+        <w:t>process.platform</w:t>
+      </w:r>
+      <w:proofErr w:type="spellEnd"/>
+      <w:proofErr w:type="gramEnd"/>
+      <w:r>
+        <w:t xml:space="preserve"> identifies the operating system. These values come from Node.js, not from browser JavaScript.</w:t>
+      </w:r>
+    </w:p>
+    <w:p/>
+    <w:p>
+      <w:r>
+        <w:t>The REPL is excellent for quick experiments, but most Node.js programs live in files so they can be saved, edited, tested, and run again. Next, you’ll create a short script and give it information from the command line.</w:t>
+      </w:r>
+    </w:p>
+    <w:p/>
+    <w:p>
+      <w:pPr>
+        <w:pStyle w:val="LabNL"/>
+      </w:pPr>
+      <w:r>
+        <w:t>Exit the REPL by pressing Ctrl-D on macOS or Linux, Ctrl-Z followed by Enter on Windows, or Ctrl-C twice on any platform.</w:t>
+      </w:r>
+    </w:p>
+    <w:p>
+      <w:pPr>
+        <w:pStyle w:val="LabNL"/>
+      </w:pPr>
+      <w:r>
+        <w:t>In your code editor, create a new file and enter the following code:</w:t>
+      </w:r>
+    </w:p>
+    <w:p/>
+    <w:p>
+      <w:pPr>
+        <w:pStyle w:val="Code"/>
+      </w:pPr>
+      <w:proofErr w:type="gramStart"/>
+      <w:r>
+        <w:t>console.log(</w:t>
+      </w:r>
+      <w:proofErr w:type="gramEnd"/>
+      <w:r>
+        <w:t>'Hello, World!');</w:t>
+      </w:r>
+    </w:p>
+    <w:p/>
+    <w:p>
+      <w:pPr>
+        <w:pStyle w:val="LabNL"/>
+      </w:pPr>
+      <w:r>
+        <w:t xml:space="preserve">Save the file as </w:t>
+      </w:r>
+      <w:r>
+        <w:rPr>
+          <w:b/>
+          <w:bCs/>
+        </w:rPr>
+        <w:t>javascript.js</w:t>
+      </w:r>
+      <w:r>
+        <w:t xml:space="preserve"> in the </w:t>
+      </w:r>
+      <w:r>
+        <w:rPr>
+          <w:b/>
+          <w:bCs/>
+        </w:rPr>
+        <w:t>labs/lab06</w:t>
+      </w:r>
+      <w:r>
+        <w:t xml:space="preserve"> directory.</w:t>
+      </w:r>
+    </w:p>
+    <w:p>
+      <w:pPr>
+        <w:pStyle w:val="LabNL"/>
+      </w:pPr>
+      <w:r>
         <w:lastRenderedPageBreak/>
-        <w:drawing>
-          <wp:inline distT="0" distB="0" distL="0" distR="0" wp14:anchorId="43778853" wp14:editId="5BB5A673">
-            <wp:extent cx="4367219" cy="2320293"/>
-            <wp:effectExtent l="0" t="0" r="1905" b="3810"/>
-            <wp:docPr id="23" name="Picture 23"/>
-            <wp:cNvGraphicFramePr>
-              <a:graphicFrameLocks xmlns:a="http://schemas.openxmlformats.org/drawingml/2006/main" noChangeAspect="1"/>
-            </wp:cNvGraphicFramePr>
-            <a:graphic xmlns:a="http://schemas.openxmlformats.org/drawingml/2006/main">
-              <a:graphicData uri="http://schemas.openxmlformats.org/drawingml/2006/picture">
-                <pic:pic xmlns:pic="http://schemas.openxmlformats.org/drawingml/2006/picture">
-                  <pic:nvPicPr>
-                    <pic:cNvPr id="0" name="hellonode.PNG"/>
-                    <pic:cNvPicPr/>
-                  </pic:nvPicPr>
-                  <pic:blipFill>
-                    <a:blip r:embed="rId12"/>
-                    <a:stretch>
-                      <a:fillRect/>
-                    </a:stretch>
-                  </pic:blipFill>
-                  <pic:spPr>
-                    <a:xfrm>
-                      <a:off x="0" y="0"/>
-                      <a:ext cx="4367219" cy="2320293"/>
-                    </a:xfrm>
-                    <a:prstGeom prst="rect">
-                      <a:avLst/>
-                    </a:prstGeom>
-                  </pic:spPr>
-                </pic:pic>
-              </a:graphicData>
-            </a:graphic>
-          </wp:inline>
-        </w:drawing>
-      </w:r>
-    </w:p>
-    <w:p>
-      <w:pPr>
-        <w:pStyle w:val="Note"/>
-      </w:pPr>
+        <w:t xml:space="preserve">In your terminal, confirm that you’re still in the directory containing </w:t>
+      </w:r>
       <w:r>
         <w:rPr>
           <w:b/>
-        </w:rPr>
-        <w:t>Note:</w:t>
-      </w:r>
-      <w:r>
-        <w:t xml:space="preserve"> Every JavaScript statement has a return value. The default return value is </w:t>
-      </w:r>
-      <w:r>
-        <w:rPr>
-          <w:rStyle w:val="InlineCode"/>
-        </w:rPr>
-        <w:t>undefined</w:t>
-      </w:r>
-      <w:r>
-        <w:t xml:space="preserve">. So, if you execute a command that doesn't have any other return value, as in this case, node outputs </w:t>
-      </w:r>
-      <w:r>
-        <w:rPr>
-          <w:rStyle w:val="InlineCode"/>
-        </w:rPr>
-        <w:t>undefined</w:t>
-      </w:r>
-      <w:r>
-        <w:t xml:space="preserve"> after the results of running the statement.</w:t>
-      </w:r>
-    </w:p>
-    <w:p/>
-    <w:p>
-      <w:r>
-        <w:t>You will not normally work with node from the interactive shell. The other way to execute code with node is to write your JavaScript into a file and execute that file.</w:t>
-      </w:r>
-    </w:p>
-    <w:p/>
-    <w:p>
-      <w:pPr>
-        <w:pStyle w:val="LabNL"/>
-        <w:numPr>
-          <w:ilvl w:val="0"/>
-          <w:numId w:val="1"/>
-        </w:numPr>
-      </w:pPr>
-      <w:r>
-        <w:t>Exit out of REPL by pressing ctrl-D (Mac or Linux) or ctrl-Z (Windows)</w:t>
-      </w:r>
-      <w:r>
-        <w:t xml:space="preserve"> or by pressing ctrl-C twice.</w:t>
-      </w:r>
-    </w:p>
-    <w:p>
-      <w:pPr>
-        <w:pStyle w:val="LabNL"/>
-        <w:numPr>
-          <w:ilvl w:val="0"/>
-          <w:numId w:val="1"/>
-        </w:numPr>
-      </w:pPr>
-      <w:r>
-        <w:t>Create a text file using your code editor and enter the following code:</w:t>
-      </w:r>
-    </w:p>
-    <w:p/>
-    <w:p>
-      <w:pPr>
-        <w:pStyle w:val="Code"/>
-      </w:pPr>
-      <w:r>
-        <w:t>console.log('Hello, World!');</w:t>
-      </w:r>
-    </w:p>
-    <w:p/>
-    <w:p>
-      <w:pPr>
-        <w:pStyle w:val="LabNL"/>
-        <w:numPr>
-          <w:ilvl w:val="0"/>
-          <w:numId w:val="1"/>
-        </w:numPr>
-      </w:pPr>
-      <w:r>
-        <w:t xml:space="preserve">Save the file as </w:t>
-      </w:r>
-      <w:r>
-        <w:rPr>
-          <w:b/>
+          <w:bCs/>
         </w:rPr>
         <w:t>javascript.js</w:t>
       </w:r>
-    </w:p>
-    <w:p>
-      <w:pPr>
-        <w:pStyle w:val="LabNL"/>
-        <w:numPr>
-          <w:ilvl w:val="0"/>
-          <w:numId w:val="1"/>
-        </w:numPr>
-      </w:pPr>
-      <w:r>
-        <w:t xml:space="preserve">In your terminal, navigate to the directory where you saved javascript.js. </w:t>
-      </w:r>
-    </w:p>
-    <w:p>
-      <w:pPr>
-        <w:pStyle w:val="LabNL"/>
-        <w:numPr>
-          <w:ilvl w:val="0"/>
-          <w:numId w:val="1"/>
-        </w:numPr>
-      </w:pPr>
-      <w:r>
-        <w:t xml:space="preserve">Once you've located javascript.js, enter </w:t>
-      </w:r>
-      <w:r>
-        <w:rPr>
-          <w:rStyle w:val="InlineCode"/>
+      <w:r>
+        <w:t>. List the directory contents if you’re unsure.</w:t>
+      </w:r>
+    </w:p>
+    <w:p>
+      <w:pPr>
+        <w:pStyle w:val="LabNL"/>
+      </w:pPr>
+      <w:r>
+        <w:t xml:space="preserve">Enter </w:t>
+      </w:r>
+      <w:r>
+        <w:rPr>
+          <w:rStyle w:val="InlineCode"/>
+          <w:rFonts w:cstheme="minorBidi"/>
         </w:rPr>
         <w:t>node javascript.js</w:t>
       </w:r>
       <w:r>
-        <w:t xml:space="preserve"> to run it.</w:t>
+        <w:t xml:space="preserve"> to run the script.</w:t>
       </w:r>
     </w:p>
     <w:p>
@@ -7159,7 +7349,7 @@
                     <pic:cNvPicPr/>
                   </pic:nvPicPr>
                   <pic:blipFill>
-                    <a:blip r:embed="rId13"/>
+                    <a:blip r:embed="rId12"/>
                     <a:stretch>
                       <a:fillRect/>
                     </a:stretch>
@@ -7182,12 +7372,191 @@
     </w:p>
     <w:p>
       <w:pPr>
-        <w:pStyle w:val="Heading2"/>
+        <w:pStyle w:val="LabNL"/>
       </w:pPr>
       <w:bookmarkStart w:id="52" w:name="_Toc519938145"/>
       <w:bookmarkStart w:id="53" w:name="_Toc242087233"/>
       <w:r>
-        <w:lastRenderedPageBreak/>
+        <w:t xml:space="preserve">Make the script accept a name from the command line. Replace the contents of </w:t>
+      </w:r>
+      <w:r>
+        <w:rPr>
+          <w:b/>
+          <w:bCs/>
+        </w:rPr>
+        <w:t>javascript.js</w:t>
+      </w:r>
+      <w:r>
+        <w:t xml:space="preserve"> with:</w:t>
+      </w:r>
+    </w:p>
+    <w:p>
+      <w:pPr>
+        <w:pStyle w:val="LabNLCode"/>
+        <w:rPr>
+          <w:sz w:val="24"/>
+          <w:szCs w:val="24"/>
+        </w:rPr>
+      </w:pPr>
+      <w:r>
+        <w:t xml:space="preserve">const name = </w:t>
+      </w:r>
+      <w:proofErr w:type="spellStart"/>
+      <w:proofErr w:type="gramStart"/>
+      <w:r>
+        <w:t>process.argv</w:t>
+      </w:r>
+      <w:proofErr w:type="spellEnd"/>
+      <w:proofErr w:type="gramEnd"/>
+      <w:r>
+        <w:t>[2</w:t>
+      </w:r>
+      <w:proofErr w:type="gramStart"/>
+      <w:r>
+        <w:t>] ??</w:t>
+      </w:r>
+      <w:proofErr w:type="gramEnd"/>
+      <w:r>
+        <w:t xml:space="preserve"> 'World';</w:t>
+      </w:r>
+      <w:r>
+        <w:br/>
+      </w:r>
+      <w:proofErr w:type="gramStart"/>
+      <w:r>
+        <w:t>console.log(</w:t>
+      </w:r>
+      <w:proofErr w:type="gramEnd"/>
+      <w:r>
+        <w:t>`Hello, ${name</w:t>
+      </w:r>
+      <w:proofErr w:type="gramStart"/>
+      <w:r>
+        <w:t>}!`</w:t>
+      </w:r>
+      <w:proofErr w:type="gramEnd"/>
+      <w:r>
+        <w:t>);</w:t>
+      </w:r>
+    </w:p>
+    <w:p>
+      <w:pPr>
+        <w:pStyle w:val="LabNLSub"/>
+        <w:rPr>
+          <w:sz w:val="24"/>
+          <w:szCs w:val="24"/>
+        </w:rPr>
+      </w:pPr>
+      <w:proofErr w:type="spellStart"/>
+      <w:proofErr w:type="gramStart"/>
+      <w:r>
+        <w:rPr>
+          <w:rStyle w:val="InlineCode"/>
+        </w:rPr>
+        <w:t>process.argv</w:t>
+      </w:r>
+      <w:proofErr w:type="spellEnd"/>
+      <w:proofErr w:type="gramEnd"/>
+      <w:r>
+        <w:t xml:space="preserve"> is an array containing the command used to start Node.js, the script name, and any additional arguments. Index 2 is the first argument you typed after the file name. The </w:t>
+      </w:r>
+      <w:r>
+        <w:rPr>
+          <w:rStyle w:val="InlineCode"/>
+        </w:rPr>
+        <w:t>??</w:t>
+      </w:r>
+      <w:r>
+        <w:t xml:space="preserve"> operator supplies </w:t>
+      </w:r>
+      <w:r>
+        <w:rPr>
+          <w:rStyle w:val="InlineCode"/>
+        </w:rPr>
+        <w:t>'World'</w:t>
+      </w:r>
+      <w:r>
+        <w:t xml:space="preserve"> when no name is provided.</w:t>
+      </w:r>
+    </w:p>
+    <w:p>
+      <w:pPr>
+        <w:pStyle w:val="LabNL"/>
+      </w:pPr>
+      <w:r>
+        <w:t>Run the script twice: once with your name and once without an argument.</w:t>
+      </w:r>
+    </w:p>
+    <w:p>
+      <w:pPr>
+        <w:pStyle w:val="LabNLCode"/>
+        <w:rPr>
+          <w:sz w:val="24"/>
+          <w:szCs w:val="24"/>
+        </w:rPr>
+      </w:pPr>
+      <w:r>
+        <w:t>node javascript.js Chris</w:t>
+      </w:r>
+      <w:r>
+        <w:br/>
+        <w:t>node javascript.js</w:t>
+      </w:r>
+    </w:p>
+    <w:p>
+      <w:pPr>
+        <w:pStyle w:val="LabNL"/>
+      </w:pPr>
+      <w:r>
+        <w:rPr>
+          <w:b/>
+          <w:bCs/>
+        </w:rPr>
+        <w:t>Challenge:</w:t>
+      </w:r>
+      <w:r>
+        <w:t xml:space="preserve"> Add a second command-line argument for a favorite framework, then print a sentence such as </w:t>
+      </w:r>
+      <w:r>
+        <w:rPr>
+          <w:rStyle w:val="InlineCode"/>
+          <w:rFonts w:asciiTheme="minorHAnsi" w:hAnsiTheme="minorHAnsi" w:cstheme="minorBidi"/>
+          <w:sz w:val="20"/>
+          <w:szCs w:val="20"/>
+        </w:rPr>
+        <w:t>Hello, Chris! You’re learning Vue.</w:t>
+      </w:r>
+      <w:r>
+        <w:t xml:space="preserve"> Use a sensible default when the framework argument is missing.</w:t>
+      </w:r>
+    </w:p>
+    <w:p>
+      <w:pPr>
+        <w:pStyle w:val="LabNLSub"/>
+        <w:rPr>
+          <w:sz w:val="24"/>
+          <w:szCs w:val="24"/>
+        </w:rPr>
+      </w:pPr>
+      <w:r>
+        <w:t xml:space="preserve">When you finish, you’ll have used Node.js interactively, inspected its runtime environment, run a saved program, and passed data into that program from the command line. Those same ideas support the </w:t>
+      </w:r>
+      <w:proofErr w:type="spellStart"/>
+      <w:r>
+        <w:t>npm</w:t>
+      </w:r>
+      <w:proofErr w:type="spellEnd"/>
+      <w:r>
+        <w:t xml:space="preserve"> tools and development scripts you’ll use in the next part.</w:t>
+      </w:r>
+    </w:p>
+    <w:bookmarkEnd w:id="52"/>
+    <w:bookmarkEnd w:id="53"/>
+    <w:p>
+      <w:pPr>
+        <w:pStyle w:val="Heading2"/>
+      </w:pPr>
+      <w:r>
         <w:t xml:space="preserve">Part </w:t>
       </w:r>
       <w:r>
@@ -7200,8 +7569,6 @@
       <w:r>
         <w:t>npm</w:t>
       </w:r>
-      <w:bookmarkEnd w:id="52"/>
-      <w:bookmarkEnd w:id="53"/>
       <w:proofErr w:type="spellEnd"/>
     </w:p>
     <w:p>
@@ -7285,6 +7652,7 @@
     </w:p>
     <w:p>
       <w:r>
+        <w:lastRenderedPageBreak/>
         <w:t>This command lists the packages that are installed globally on your computer. npm ships with Node.js, so the way to update it is normally to install a newer Node.js release rather than to update npm on its own.</w:t>
       </w:r>
     </w:p>
@@ -7504,9 +7872,9 @@
         <w:pStyle w:val="Heading1"/>
       </w:pPr>
       <w:bookmarkStart w:id="54" w:name="_Toc519938150"/>
-      <w:bookmarkStart w:id="55" w:name="_Toc356736168"/>
-      <w:bookmarkStart w:id="56" w:name="_Toc519938151"/>
-      <w:bookmarkStart w:id="57" w:name="_Toc242087234"/>
+      <w:bookmarkStart w:id="55" w:name="_Toc242087234"/>
+      <w:bookmarkStart w:id="56" w:name="_Toc356736168"/>
+      <w:bookmarkStart w:id="57" w:name="_Toc519938151"/>
       <w:r>
         <w:lastRenderedPageBreak/>
         <w:t>Lab 0</w:t>
@@ -7518,7 +7886,7 @@
         <w:t xml:space="preserve"> - Initialize npm</w:t>
       </w:r>
       <w:bookmarkEnd w:id="54"/>
-      <w:bookmarkEnd w:id="57"/>
+      <w:bookmarkEnd w:id="55"/>
       <w:r>
         <w:t xml:space="preserve"> </w:t>
       </w:r>
@@ -7745,8 +8113,8 @@
       <w:r>
         <w:t xml:space="preserve">: </w:t>
       </w:r>
-      <w:bookmarkEnd w:id="55"/>
       <w:bookmarkEnd w:id="56"/>
+      <w:bookmarkEnd w:id="57"/>
       <w:r>
         <w:t>How to Write and Run npm Scripts</w:t>
       </w:r>
@@ -8118,8 +8486,8 @@
         <w:pStyle w:val="Heading1"/>
       </w:pPr>
       <w:bookmarkStart w:id="61" w:name="_Toc520709946"/>
-      <w:bookmarkStart w:id="62" w:name="_Toc519938155"/>
-      <w:bookmarkStart w:id="63" w:name="_Toc242087236"/>
+      <w:bookmarkStart w:id="62" w:name="_Toc242087236"/>
+      <w:bookmarkStart w:id="63" w:name="_Toc519938155"/>
       <w:r>
         <w:lastRenderedPageBreak/>
         <w:t>Lab 0</w:t>
@@ -8131,7 +8499,7 @@
         <w:t>: Making a Web Server</w:t>
       </w:r>
       <w:bookmarkEnd w:id="61"/>
-      <w:bookmarkEnd w:id="63"/>
+      <w:bookmarkEnd w:id="62"/>
     </w:p>
     <w:p>
       <w:r>
@@ -9130,7 +9498,7 @@
       </w:r>
     </w:p>
     <w:p/>
-    <w:bookmarkEnd w:id="62"/>
+    <w:bookmarkEnd w:id="63"/>
     <w:p>
       <w:pPr>
         <w:rPr>
@@ -10195,7 +10563,7 @@
                     <pic:cNvPicPr/>
                   </pic:nvPicPr>
                   <pic:blipFill>
-                    <a:blip r:embed="rId14">
+                    <a:blip r:embed="rId13">
                       <a:extLst>
                         <a:ext uri="{28A0092B-C50C-407E-A947-70E740481C1C}">
                           <a14:useLocalDpi xmlns:a14="http://schemas.microsoft.com/office/drawing/2010/main" val="0"/>
@@ -11452,13 +11820,13 @@
       <w:pPr>
         <w:pStyle w:val="Heading1"/>
       </w:pPr>
-      <w:bookmarkStart w:id="121" w:name="OLE_LINK81"/>
-      <w:bookmarkStart w:id="122" w:name="_Toc242087245"/>
+      <w:bookmarkStart w:id="121" w:name="_Toc242087245"/>
+      <w:bookmarkStart w:id="122" w:name="OLE_LINK81"/>
       <w:r>
         <w:lastRenderedPageBreak/>
         <w:t>Lab 17: Forms</w:t>
       </w:r>
-      <w:bookmarkEnd w:id="122"/>
+      <w:bookmarkEnd w:id="121"/>
     </w:p>
     <w:p>
       <w:r>
@@ -11646,7 +12014,7 @@
         <w:t>Challenge: make the search consider the description text as well as the title.</w:t>
       </w:r>
     </w:p>
-    <w:bookmarkEnd w:id="121"/>
+    <w:bookmarkEnd w:id="122"/>
     <w:bookmarkEnd w:id="127"/>
     <w:p/>
     <w:p>
@@ -11666,8 +12034,8 @@
       <w:pPr>
         <w:pStyle w:val="Heading1"/>
       </w:pPr>
-      <w:bookmarkStart w:id="128" w:name="OLE_LINK80"/>
-      <w:bookmarkStart w:id="129" w:name="_Toc242087246"/>
+      <w:bookmarkStart w:id="128" w:name="_Toc242087246"/>
+      <w:bookmarkStart w:id="129" w:name="OLE_LINK80"/>
       <w:r>
         <w:lastRenderedPageBreak/>
         <w:t xml:space="preserve">Lab </w:t>
@@ -11684,7 +12052,7 @@
       <w:r>
         <w:t>Slots</w:t>
       </w:r>
-      <w:bookmarkEnd w:id="129"/>
+      <w:bookmarkEnd w:id="128"/>
     </w:p>
     <w:p>
       <w:r>
@@ -11692,7 +12060,7 @@
       </w:r>
     </w:p>
     <w:p/>
-    <w:bookmarkEnd w:id="128"/>
+    <w:bookmarkEnd w:id="129"/>
     <w:p>
       <w:pPr>
         <w:pStyle w:val="LabNL"/>
@@ -13378,8 +13746,8 @@
       <w:pPr>
         <w:pStyle w:val="Heading1"/>
       </w:pPr>
-      <w:bookmarkStart w:id="131" w:name="OLE_LINK83"/>
-      <w:bookmarkStart w:id="132" w:name="_Toc242087247"/>
+      <w:bookmarkStart w:id="131" w:name="_Toc242087247"/>
+      <w:bookmarkStart w:id="132" w:name="OLE_LINK83"/>
       <w:r>
         <w:lastRenderedPageBreak/>
         <w:t xml:space="preserve">Lab 19: </w:t>
@@ -13388,7 +13756,7 @@
       <w:r>
         <w:t>Composables</w:t>
       </w:r>
-      <w:bookmarkEnd w:id="132"/>
+      <w:bookmarkEnd w:id="131"/>
       <w:proofErr w:type="spellEnd"/>
     </w:p>
     <w:p>
@@ -13588,18 +13956,18 @@
         <w:t>Challenge: implement filtering of the tags in the right column, reusing the same composable.</w:t>
       </w:r>
     </w:p>
-    <w:bookmarkEnd w:id="131"/>
+    <w:bookmarkEnd w:id="132"/>
     <w:p/>
     <w:p>
       <w:pPr>
         <w:pStyle w:val="Heading1"/>
       </w:pPr>
-      <w:bookmarkStart w:id="133" w:name="OLE_LINK84"/>
-      <w:bookmarkStart w:id="134" w:name="_Toc242087248"/>
+      <w:bookmarkStart w:id="133" w:name="_Toc242087248"/>
+      <w:bookmarkStart w:id="134" w:name="OLE_LINK84"/>
       <w:r>
         <w:t>Lab 20: Implementing Pinia</w:t>
       </w:r>
-      <w:bookmarkEnd w:id="134"/>
+      <w:bookmarkEnd w:id="133"/>
     </w:p>
     <w:p>
       <w:r>
@@ -14504,7 +14872,7 @@
         <w:t>Challenge: clicking on a tag in the list of popular tags should filter the display of articles.</w:t>
       </w:r>
     </w:p>
-    <w:bookmarkEnd w:id="133"/>
+    <w:bookmarkEnd w:id="134"/>
     <w:p/>
     <w:p>
       <w:pPr>
@@ -20304,6 +20672,797 @@
 <file path=word/numbering.xml><?xml version="1.0" encoding="utf-8"?>
 <w:numbering xmlns:wpc="http://schemas.microsoft.com/office/word/2010/wordprocessingCanvas" xmlns:cx="http://schemas.microsoft.com/office/drawing/2014/chartex" xmlns:cx1="http://schemas.microsoft.com/office/drawing/2015/9/8/chartex" xmlns:cx2="http://schemas.microsoft.com/office/drawing/2015/10/21/chartex" xmlns:cx3="http://schemas.microsoft.com/office/drawing/2016/5/9/chartex" xmlns:cx4="http://schemas.microsoft.com/office/drawing/2016/5/10/chartex" xmlns:cx5="http://schemas.microsoft.com/office/drawing/2016/5/11/chartex" xmlns:cx6="http://schemas.microsoft.com/office/drawing/2016/5/12/chartex" xmlns:cx7="http://schemas.microsoft.com/office/drawing/2016/5/13/chartex" xmlns:cx8="http://schemas.microsoft.com/office/drawing/2016/5/14/chartex" xmlns:mc="http://schemas.openxmlformats.org/markup-compatibility/2006" xmlns:m="http://schemas.openxmlformats.org/officeDocument/2006/math" xmlns:aink="http://schemas.microsoft.com/office/drawing/2016/ink" xmlns:am3d="http://schemas.microsoft.com/office/drawing/2017/model3d" xmlns:oel="http://schemas.microsoft.com/office/2019/extlst" xmlns:r="http://schemas.openxmlformats.org/officeDocument/2006/relationships" xmlns:wp14="http://schemas.microsoft.com/office/word/2010/wordprocessingDrawing" xmlns:wp="http://schemas.openxmlformats.org/drawingml/2006/wordprocessingDrawing" xmlns:wpg="http://schemas.microsoft.com/office/word/2010/wordprocessingGroup" xmlns:wpi="http://schemas.microsoft.com/office/word/2010/wordprocessingInk" xmlns:wps="http://schemas.microsoft.com/office/word/2010/wordprocessingShape" xmlns:o="urn:schemas-microsoft-com:office:office" xmlns:v="urn:schemas-microsoft-com:vml" xmlns:w10="urn:schemas-microsoft-com:office:word" xmlns:w="http://schemas.openxmlformats.org/wordprocessingml/2006/main" xmlns:w14="http://schemas.microsoft.com/office/word/2010/wordml" xmlns:w15="http://schemas.microsoft.com/office/word/2012/wordml" xmlns:w16cex="http://schemas.microsoft.com/office/word/2018/wordml/cex" xmlns:w16cid="http://schemas.microsoft.com/office/word/2016/wordml/cid" xmlns:w16="http://schemas.microsoft.com/office/word/2018/wordml" xmlns:w16sdtdh="http://schemas.microsoft.com/office/word/2020/wordml/sdtdatahash" xmlns:w16sdtfl="http://schemas.microsoft.com/office/word/2024/wordml/sdtformatlock" xmlns:w16se="http://schemas.microsoft.com/office/word/2015/wordml/symex" xmlns:w16du="http://schemas.microsoft.com/office/word/2023/wordml/word16du" xmlns:wne="http://schemas.microsoft.com/office/word/2006/wordml" mc:Ignorable="w14 w15 w16se w16cid w16 w16cex w16sdtdh w16sdtfl w16du wp14">
   <w:abstractNum w:abstractNumId="0" w15:restartNumberingAfterBreak="0">
+    <w:nsid w:val="06CA13E5"/>
+    <w:multiLevelType w:val="multilevel"/>
+    <w:tmpl w:val="ED6CF734"/>
+    <w:lvl w:ilvl="0">
+      <w:start w:val="7"/>
+      <w:numFmt w:val="decimal"/>
+      <w:lvlText w:val="%1."/>
+      <w:lvlJc w:val="left"/>
+      <w:pPr>
+        <w:tabs>
+          <w:tab w:val="num" w:pos="720"/>
+        </w:tabs>
+        <w:ind w:left="720" w:hanging="360"/>
+      </w:pPr>
+    </w:lvl>
+    <w:lvl w:ilvl="1" w:tentative="1">
+      <w:start w:val="1"/>
+      <w:numFmt w:val="decimal"/>
+      <w:lvlText w:val="%2."/>
+      <w:lvlJc w:val="left"/>
+      <w:pPr>
+        <w:tabs>
+          <w:tab w:val="num" w:pos="1440"/>
+        </w:tabs>
+        <w:ind w:left="1440" w:hanging="360"/>
+      </w:pPr>
+    </w:lvl>
+    <w:lvl w:ilvl="2" w:tentative="1">
+      <w:start w:val="1"/>
+      <w:numFmt w:val="decimal"/>
+      <w:lvlText w:val="%3."/>
+      <w:lvlJc w:val="left"/>
+      <w:pPr>
+        <w:tabs>
+          <w:tab w:val="num" w:pos="2160"/>
+        </w:tabs>
+        <w:ind w:left="2160" w:hanging="360"/>
+      </w:pPr>
+    </w:lvl>
+    <w:lvl w:ilvl="3" w:tentative="1">
+      <w:start w:val="1"/>
+      <w:numFmt w:val="decimal"/>
+      <w:lvlText w:val="%4."/>
+      <w:lvlJc w:val="left"/>
+      <w:pPr>
+        <w:tabs>
+          <w:tab w:val="num" w:pos="2880"/>
+        </w:tabs>
+        <w:ind w:left="2880" w:hanging="360"/>
+      </w:pPr>
+    </w:lvl>
+    <w:lvl w:ilvl="4" w:tentative="1">
+      <w:start w:val="1"/>
+      <w:numFmt w:val="decimal"/>
+      <w:lvlText w:val="%5."/>
+      <w:lvlJc w:val="left"/>
+      <w:pPr>
+        <w:tabs>
+          <w:tab w:val="num" w:pos="3600"/>
+        </w:tabs>
+        <w:ind w:left="3600" w:hanging="360"/>
+      </w:pPr>
+    </w:lvl>
+    <w:lvl w:ilvl="5" w:tentative="1">
+      <w:start w:val="1"/>
+      <w:numFmt w:val="decimal"/>
+      <w:lvlText w:val="%6."/>
+      <w:lvlJc w:val="left"/>
+      <w:pPr>
+        <w:tabs>
+          <w:tab w:val="num" w:pos="4320"/>
+        </w:tabs>
+        <w:ind w:left="4320" w:hanging="360"/>
+      </w:pPr>
+    </w:lvl>
+    <w:lvl w:ilvl="6" w:tentative="1">
+      <w:start w:val="1"/>
+      <w:numFmt w:val="decimal"/>
+      <w:lvlText w:val="%7."/>
+      <w:lvlJc w:val="left"/>
+      <w:pPr>
+        <w:tabs>
+          <w:tab w:val="num" w:pos="5040"/>
+        </w:tabs>
+        <w:ind w:left="5040" w:hanging="360"/>
+      </w:pPr>
+    </w:lvl>
+    <w:lvl w:ilvl="7" w:tentative="1">
+      <w:start w:val="1"/>
+      <w:numFmt w:val="decimal"/>
+      <w:lvlText w:val="%8."/>
+      <w:lvlJc w:val="left"/>
+      <w:pPr>
+        <w:tabs>
+          <w:tab w:val="num" w:pos="5760"/>
+        </w:tabs>
+        <w:ind w:left="5760" w:hanging="360"/>
+      </w:pPr>
+    </w:lvl>
+    <w:lvl w:ilvl="8" w:tentative="1">
+      <w:start w:val="1"/>
+      <w:numFmt w:val="decimal"/>
+      <w:lvlText w:val="%9."/>
+      <w:lvlJc w:val="left"/>
+      <w:pPr>
+        <w:tabs>
+          <w:tab w:val="num" w:pos="6480"/>
+        </w:tabs>
+        <w:ind w:left="6480" w:hanging="360"/>
+      </w:pPr>
+    </w:lvl>
+  </w:abstractNum>
+  <w:abstractNum w:abstractNumId="1" w15:restartNumberingAfterBreak="0">
+    <w:nsid w:val="07FD364F"/>
+    <w:multiLevelType w:val="multilevel"/>
+    <w:tmpl w:val="504010C4"/>
+    <w:lvl w:ilvl="0">
+      <w:start w:val="13"/>
+      <w:numFmt w:val="decimal"/>
+      <w:lvlText w:val="%1."/>
+      <w:lvlJc w:val="left"/>
+      <w:pPr>
+        <w:tabs>
+          <w:tab w:val="num" w:pos="720"/>
+        </w:tabs>
+        <w:ind w:left="720" w:hanging="360"/>
+      </w:pPr>
+    </w:lvl>
+    <w:lvl w:ilvl="1" w:tentative="1">
+      <w:start w:val="1"/>
+      <w:numFmt w:val="decimal"/>
+      <w:lvlText w:val="%2."/>
+      <w:lvlJc w:val="left"/>
+      <w:pPr>
+        <w:tabs>
+          <w:tab w:val="num" w:pos="1440"/>
+        </w:tabs>
+        <w:ind w:left="1440" w:hanging="360"/>
+      </w:pPr>
+    </w:lvl>
+    <w:lvl w:ilvl="2" w:tentative="1">
+      <w:start w:val="1"/>
+      <w:numFmt w:val="decimal"/>
+      <w:lvlText w:val="%3."/>
+      <w:lvlJc w:val="left"/>
+      <w:pPr>
+        <w:tabs>
+          <w:tab w:val="num" w:pos="2160"/>
+        </w:tabs>
+        <w:ind w:left="2160" w:hanging="360"/>
+      </w:pPr>
+    </w:lvl>
+    <w:lvl w:ilvl="3" w:tentative="1">
+      <w:start w:val="1"/>
+      <w:numFmt w:val="decimal"/>
+      <w:lvlText w:val="%4."/>
+      <w:lvlJc w:val="left"/>
+      <w:pPr>
+        <w:tabs>
+          <w:tab w:val="num" w:pos="2880"/>
+        </w:tabs>
+        <w:ind w:left="2880" w:hanging="360"/>
+      </w:pPr>
+    </w:lvl>
+    <w:lvl w:ilvl="4" w:tentative="1">
+      <w:start w:val="1"/>
+      <w:numFmt w:val="decimal"/>
+      <w:lvlText w:val="%5."/>
+      <w:lvlJc w:val="left"/>
+      <w:pPr>
+        <w:tabs>
+          <w:tab w:val="num" w:pos="3600"/>
+        </w:tabs>
+        <w:ind w:left="3600" w:hanging="360"/>
+      </w:pPr>
+    </w:lvl>
+    <w:lvl w:ilvl="5" w:tentative="1">
+      <w:start w:val="1"/>
+      <w:numFmt w:val="decimal"/>
+      <w:lvlText w:val="%6."/>
+      <w:lvlJc w:val="left"/>
+      <w:pPr>
+        <w:tabs>
+          <w:tab w:val="num" w:pos="4320"/>
+        </w:tabs>
+        <w:ind w:left="4320" w:hanging="360"/>
+      </w:pPr>
+    </w:lvl>
+    <w:lvl w:ilvl="6" w:tentative="1">
+      <w:start w:val="1"/>
+      <w:numFmt w:val="decimal"/>
+      <w:lvlText w:val="%7."/>
+      <w:lvlJc w:val="left"/>
+      <w:pPr>
+        <w:tabs>
+          <w:tab w:val="num" w:pos="5040"/>
+        </w:tabs>
+        <w:ind w:left="5040" w:hanging="360"/>
+      </w:pPr>
+    </w:lvl>
+    <w:lvl w:ilvl="7" w:tentative="1">
+      <w:start w:val="1"/>
+      <w:numFmt w:val="decimal"/>
+      <w:lvlText w:val="%8."/>
+      <w:lvlJc w:val="left"/>
+      <w:pPr>
+        <w:tabs>
+          <w:tab w:val="num" w:pos="5760"/>
+        </w:tabs>
+        <w:ind w:left="5760" w:hanging="360"/>
+      </w:pPr>
+    </w:lvl>
+    <w:lvl w:ilvl="8" w:tentative="1">
+      <w:start w:val="1"/>
+      <w:numFmt w:val="decimal"/>
+      <w:lvlText w:val="%9."/>
+      <w:lvlJc w:val="left"/>
+      <w:pPr>
+        <w:tabs>
+          <w:tab w:val="num" w:pos="6480"/>
+        </w:tabs>
+        <w:ind w:left="6480" w:hanging="360"/>
+      </w:pPr>
+    </w:lvl>
+  </w:abstractNum>
+  <w:abstractNum w:abstractNumId="2" w15:restartNumberingAfterBreak="0">
+    <w:nsid w:val="09B929E6"/>
+    <w:multiLevelType w:val="multilevel"/>
+    <w:tmpl w:val="4C90A1B2"/>
+    <w:lvl w:ilvl="0">
+      <w:start w:val="5"/>
+      <w:numFmt w:val="decimal"/>
+      <w:lvlText w:val="%1."/>
+      <w:lvlJc w:val="left"/>
+      <w:pPr>
+        <w:tabs>
+          <w:tab w:val="num" w:pos="720"/>
+        </w:tabs>
+        <w:ind w:left="720" w:hanging="360"/>
+      </w:pPr>
+    </w:lvl>
+    <w:lvl w:ilvl="1" w:tentative="1">
+      <w:start w:val="1"/>
+      <w:numFmt w:val="decimal"/>
+      <w:lvlText w:val="%2."/>
+      <w:lvlJc w:val="left"/>
+      <w:pPr>
+        <w:tabs>
+          <w:tab w:val="num" w:pos="1440"/>
+        </w:tabs>
+        <w:ind w:left="1440" w:hanging="360"/>
+      </w:pPr>
+    </w:lvl>
+    <w:lvl w:ilvl="2" w:tentative="1">
+      <w:start w:val="1"/>
+      <w:numFmt w:val="decimal"/>
+      <w:lvlText w:val="%3."/>
+      <w:lvlJc w:val="left"/>
+      <w:pPr>
+        <w:tabs>
+          <w:tab w:val="num" w:pos="2160"/>
+        </w:tabs>
+        <w:ind w:left="2160" w:hanging="360"/>
+      </w:pPr>
+    </w:lvl>
+    <w:lvl w:ilvl="3" w:tentative="1">
+      <w:start w:val="1"/>
+      <w:numFmt w:val="decimal"/>
+      <w:lvlText w:val="%4."/>
+      <w:lvlJc w:val="left"/>
+      <w:pPr>
+        <w:tabs>
+          <w:tab w:val="num" w:pos="2880"/>
+        </w:tabs>
+        <w:ind w:left="2880" w:hanging="360"/>
+      </w:pPr>
+    </w:lvl>
+    <w:lvl w:ilvl="4" w:tentative="1">
+      <w:start w:val="1"/>
+      <w:numFmt w:val="decimal"/>
+      <w:lvlText w:val="%5."/>
+      <w:lvlJc w:val="left"/>
+      <w:pPr>
+        <w:tabs>
+          <w:tab w:val="num" w:pos="3600"/>
+        </w:tabs>
+        <w:ind w:left="3600" w:hanging="360"/>
+      </w:pPr>
+    </w:lvl>
+    <w:lvl w:ilvl="5" w:tentative="1">
+      <w:start w:val="1"/>
+      <w:numFmt w:val="decimal"/>
+      <w:lvlText w:val="%6."/>
+      <w:lvlJc w:val="left"/>
+      <w:pPr>
+        <w:tabs>
+          <w:tab w:val="num" w:pos="4320"/>
+        </w:tabs>
+        <w:ind w:left="4320" w:hanging="360"/>
+      </w:pPr>
+    </w:lvl>
+    <w:lvl w:ilvl="6" w:tentative="1">
+      <w:start w:val="1"/>
+      <w:numFmt w:val="decimal"/>
+      <w:lvlText w:val="%7."/>
+      <w:lvlJc w:val="left"/>
+      <w:pPr>
+        <w:tabs>
+          <w:tab w:val="num" w:pos="5040"/>
+        </w:tabs>
+        <w:ind w:left="5040" w:hanging="360"/>
+      </w:pPr>
+    </w:lvl>
+    <w:lvl w:ilvl="7" w:tentative="1">
+      <w:start w:val="1"/>
+      <w:numFmt w:val="decimal"/>
+      <w:lvlText w:val="%8."/>
+      <w:lvlJc w:val="left"/>
+      <w:pPr>
+        <w:tabs>
+          <w:tab w:val="num" w:pos="5760"/>
+        </w:tabs>
+        <w:ind w:left="5760" w:hanging="360"/>
+      </w:pPr>
+    </w:lvl>
+    <w:lvl w:ilvl="8" w:tentative="1">
+      <w:start w:val="1"/>
+      <w:numFmt w:val="decimal"/>
+      <w:lvlText w:val="%9."/>
+      <w:lvlJc w:val="left"/>
+      <w:pPr>
+        <w:tabs>
+          <w:tab w:val="num" w:pos="6480"/>
+        </w:tabs>
+        <w:ind w:left="6480" w:hanging="360"/>
+      </w:pPr>
+    </w:lvl>
+  </w:abstractNum>
+  <w:abstractNum w:abstractNumId="3" w15:restartNumberingAfterBreak="0">
+    <w:nsid w:val="1A682E04"/>
+    <w:multiLevelType w:val="multilevel"/>
+    <w:tmpl w:val="0DC0D65A"/>
+    <w:lvl w:ilvl="0">
+      <w:start w:val="4"/>
+      <w:numFmt w:val="decimal"/>
+      <w:lvlText w:val="%1."/>
+      <w:lvlJc w:val="left"/>
+      <w:pPr>
+        <w:tabs>
+          <w:tab w:val="num" w:pos="720"/>
+        </w:tabs>
+        <w:ind w:left="720" w:hanging="360"/>
+      </w:pPr>
+    </w:lvl>
+    <w:lvl w:ilvl="1" w:tentative="1">
+      <w:start w:val="1"/>
+      <w:numFmt w:val="decimal"/>
+      <w:lvlText w:val="%2."/>
+      <w:lvlJc w:val="left"/>
+      <w:pPr>
+        <w:tabs>
+          <w:tab w:val="num" w:pos="1440"/>
+        </w:tabs>
+        <w:ind w:left="1440" w:hanging="360"/>
+      </w:pPr>
+    </w:lvl>
+    <w:lvl w:ilvl="2" w:tentative="1">
+      <w:start w:val="1"/>
+      <w:numFmt w:val="decimal"/>
+      <w:lvlText w:val="%3."/>
+      <w:lvlJc w:val="left"/>
+      <w:pPr>
+        <w:tabs>
+          <w:tab w:val="num" w:pos="2160"/>
+        </w:tabs>
+        <w:ind w:left="2160" w:hanging="360"/>
+      </w:pPr>
+    </w:lvl>
+    <w:lvl w:ilvl="3" w:tentative="1">
+      <w:start w:val="1"/>
+      <w:numFmt w:val="decimal"/>
+      <w:lvlText w:val="%4."/>
+      <w:lvlJc w:val="left"/>
+      <w:pPr>
+        <w:tabs>
+          <w:tab w:val="num" w:pos="2880"/>
+        </w:tabs>
+        <w:ind w:left="2880" w:hanging="360"/>
+      </w:pPr>
+    </w:lvl>
+    <w:lvl w:ilvl="4" w:tentative="1">
+      <w:start w:val="1"/>
+      <w:numFmt w:val="decimal"/>
+      <w:lvlText w:val="%5."/>
+      <w:lvlJc w:val="left"/>
+      <w:pPr>
+        <w:tabs>
+          <w:tab w:val="num" w:pos="3600"/>
+        </w:tabs>
+        <w:ind w:left="3600" w:hanging="360"/>
+      </w:pPr>
+    </w:lvl>
+    <w:lvl w:ilvl="5" w:tentative="1">
+      <w:start w:val="1"/>
+      <w:numFmt w:val="decimal"/>
+      <w:lvlText w:val="%6."/>
+      <w:lvlJc w:val="left"/>
+      <w:pPr>
+        <w:tabs>
+          <w:tab w:val="num" w:pos="4320"/>
+        </w:tabs>
+        <w:ind w:left="4320" w:hanging="360"/>
+      </w:pPr>
+    </w:lvl>
+    <w:lvl w:ilvl="6" w:tentative="1">
+      <w:start w:val="1"/>
+      <w:numFmt w:val="decimal"/>
+      <w:lvlText w:val="%7."/>
+      <w:lvlJc w:val="left"/>
+      <w:pPr>
+        <w:tabs>
+          <w:tab w:val="num" w:pos="5040"/>
+        </w:tabs>
+        <w:ind w:left="5040" w:hanging="360"/>
+      </w:pPr>
+    </w:lvl>
+    <w:lvl w:ilvl="7" w:tentative="1">
+      <w:start w:val="1"/>
+      <w:numFmt w:val="decimal"/>
+      <w:lvlText w:val="%8."/>
+      <w:lvlJc w:val="left"/>
+      <w:pPr>
+        <w:tabs>
+          <w:tab w:val="num" w:pos="5760"/>
+        </w:tabs>
+        <w:ind w:left="5760" w:hanging="360"/>
+      </w:pPr>
+    </w:lvl>
+    <w:lvl w:ilvl="8" w:tentative="1">
+      <w:start w:val="1"/>
+      <w:numFmt w:val="decimal"/>
+      <w:lvlText w:val="%9."/>
+      <w:lvlJc w:val="left"/>
+      <w:pPr>
+        <w:tabs>
+          <w:tab w:val="num" w:pos="6480"/>
+        </w:tabs>
+        <w:ind w:left="6480" w:hanging="360"/>
+      </w:pPr>
+    </w:lvl>
+  </w:abstractNum>
+  <w:abstractNum w:abstractNumId="4" w15:restartNumberingAfterBreak="0">
+    <w:nsid w:val="1EE601E0"/>
+    <w:multiLevelType w:val="multilevel"/>
+    <w:tmpl w:val="1F3247AE"/>
+    <w:lvl w:ilvl="0">
+      <w:start w:val="10"/>
+      <w:numFmt w:val="decimal"/>
+      <w:lvlText w:val="%1."/>
+      <w:lvlJc w:val="left"/>
+      <w:pPr>
+        <w:tabs>
+          <w:tab w:val="num" w:pos="720"/>
+        </w:tabs>
+        <w:ind w:left="720" w:hanging="360"/>
+      </w:pPr>
+    </w:lvl>
+    <w:lvl w:ilvl="1" w:tentative="1">
+      <w:start w:val="1"/>
+      <w:numFmt w:val="decimal"/>
+      <w:lvlText w:val="%2."/>
+      <w:lvlJc w:val="left"/>
+      <w:pPr>
+        <w:tabs>
+          <w:tab w:val="num" w:pos="1440"/>
+        </w:tabs>
+        <w:ind w:left="1440" w:hanging="360"/>
+      </w:pPr>
+    </w:lvl>
+    <w:lvl w:ilvl="2" w:tentative="1">
+      <w:start w:val="1"/>
+      <w:numFmt w:val="decimal"/>
+      <w:lvlText w:val="%3."/>
+      <w:lvlJc w:val="left"/>
+      <w:pPr>
+        <w:tabs>
+          <w:tab w:val="num" w:pos="2160"/>
+        </w:tabs>
+        <w:ind w:left="2160" w:hanging="360"/>
+      </w:pPr>
+    </w:lvl>
+    <w:lvl w:ilvl="3" w:tentative="1">
+      <w:start w:val="1"/>
+      <w:numFmt w:val="decimal"/>
+      <w:lvlText w:val="%4."/>
+      <w:lvlJc w:val="left"/>
+      <w:pPr>
+        <w:tabs>
+          <w:tab w:val="num" w:pos="2880"/>
+        </w:tabs>
+        <w:ind w:left="2880" w:hanging="360"/>
+      </w:pPr>
+    </w:lvl>
+    <w:lvl w:ilvl="4" w:tentative="1">
+      <w:start w:val="1"/>
+      <w:numFmt w:val="decimal"/>
+      <w:lvlText w:val="%5."/>
+      <w:lvlJc w:val="left"/>
+      <w:pPr>
+        <w:tabs>
+          <w:tab w:val="num" w:pos="3600"/>
+        </w:tabs>
+        <w:ind w:left="3600" w:hanging="360"/>
+      </w:pPr>
+    </w:lvl>
+    <w:lvl w:ilvl="5" w:tentative="1">
+      <w:start w:val="1"/>
+      <w:numFmt w:val="decimal"/>
+      <w:lvlText w:val="%6."/>
+      <w:lvlJc w:val="left"/>
+      <w:pPr>
+        <w:tabs>
+          <w:tab w:val="num" w:pos="4320"/>
+        </w:tabs>
+        <w:ind w:left="4320" w:hanging="360"/>
+      </w:pPr>
+    </w:lvl>
+    <w:lvl w:ilvl="6" w:tentative="1">
+      <w:start w:val="1"/>
+      <w:numFmt w:val="decimal"/>
+      <w:lvlText w:val="%7."/>
+      <w:lvlJc w:val="left"/>
+      <w:pPr>
+        <w:tabs>
+          <w:tab w:val="num" w:pos="5040"/>
+        </w:tabs>
+        <w:ind w:left="5040" w:hanging="360"/>
+      </w:pPr>
+    </w:lvl>
+    <w:lvl w:ilvl="7" w:tentative="1">
+      <w:start w:val="1"/>
+      <w:numFmt w:val="decimal"/>
+      <w:lvlText w:val="%8."/>
+      <w:lvlJc w:val="left"/>
+      <w:pPr>
+        <w:tabs>
+          <w:tab w:val="num" w:pos="5760"/>
+        </w:tabs>
+        <w:ind w:left="5760" w:hanging="360"/>
+      </w:pPr>
+    </w:lvl>
+    <w:lvl w:ilvl="8" w:tentative="1">
+      <w:start w:val="1"/>
+      <w:numFmt w:val="decimal"/>
+      <w:lvlText w:val="%9."/>
+      <w:lvlJc w:val="left"/>
+      <w:pPr>
+        <w:tabs>
+          <w:tab w:val="num" w:pos="6480"/>
+        </w:tabs>
+        <w:ind w:left="6480" w:hanging="360"/>
+      </w:pPr>
+    </w:lvl>
+  </w:abstractNum>
+  <w:abstractNum w:abstractNumId="5" w15:restartNumberingAfterBreak="0">
+    <w:nsid w:val="21D179F9"/>
+    <w:multiLevelType w:val="multilevel"/>
+    <w:tmpl w:val="44E2FD8E"/>
+    <w:lvl w:ilvl="0">
+      <w:start w:val="8"/>
+      <w:numFmt w:val="decimal"/>
+      <w:lvlText w:val="%1."/>
+      <w:lvlJc w:val="left"/>
+      <w:pPr>
+        <w:tabs>
+          <w:tab w:val="num" w:pos="720"/>
+        </w:tabs>
+        <w:ind w:left="720" w:hanging="360"/>
+      </w:pPr>
+    </w:lvl>
+    <w:lvl w:ilvl="1" w:tentative="1">
+      <w:start w:val="1"/>
+      <w:numFmt w:val="decimal"/>
+      <w:lvlText w:val="%2."/>
+      <w:lvlJc w:val="left"/>
+      <w:pPr>
+        <w:tabs>
+          <w:tab w:val="num" w:pos="1440"/>
+        </w:tabs>
+        <w:ind w:left="1440" w:hanging="360"/>
+      </w:pPr>
+    </w:lvl>
+    <w:lvl w:ilvl="2" w:tentative="1">
+      <w:start w:val="1"/>
+      <w:numFmt w:val="decimal"/>
+      <w:lvlText w:val="%3."/>
+      <w:lvlJc w:val="left"/>
+      <w:pPr>
+        <w:tabs>
+          <w:tab w:val="num" w:pos="2160"/>
+        </w:tabs>
+        <w:ind w:left="2160" w:hanging="360"/>
+      </w:pPr>
+    </w:lvl>
+    <w:lvl w:ilvl="3" w:tentative="1">
+      <w:start w:val="1"/>
+      <w:numFmt w:val="decimal"/>
+      <w:lvlText w:val="%4."/>
+      <w:lvlJc w:val="left"/>
+      <w:pPr>
+        <w:tabs>
+          <w:tab w:val="num" w:pos="2880"/>
+        </w:tabs>
+        <w:ind w:left="2880" w:hanging="360"/>
+      </w:pPr>
+    </w:lvl>
+    <w:lvl w:ilvl="4" w:tentative="1">
+      <w:start w:val="1"/>
+      <w:numFmt w:val="decimal"/>
+      <w:lvlText w:val="%5."/>
+      <w:lvlJc w:val="left"/>
+      <w:pPr>
+        <w:tabs>
+          <w:tab w:val="num" w:pos="3600"/>
+        </w:tabs>
+        <w:ind w:left="3600" w:hanging="360"/>
+      </w:pPr>
+    </w:lvl>
+    <w:lvl w:ilvl="5" w:tentative="1">
+      <w:start w:val="1"/>
+      <w:numFmt w:val="decimal"/>
+      <w:lvlText w:val="%6."/>
+      <w:lvlJc w:val="left"/>
+      <w:pPr>
+        <w:tabs>
+          <w:tab w:val="num" w:pos="4320"/>
+        </w:tabs>
+        <w:ind w:left="4320" w:hanging="360"/>
+      </w:pPr>
+    </w:lvl>
+    <w:lvl w:ilvl="6" w:tentative="1">
+      <w:start w:val="1"/>
+      <w:numFmt w:val="decimal"/>
+      <w:lvlText w:val="%7."/>
+      <w:lvlJc w:val="left"/>
+      <w:pPr>
+        <w:tabs>
+          <w:tab w:val="num" w:pos="5040"/>
+        </w:tabs>
+        <w:ind w:left="5040" w:hanging="360"/>
+      </w:pPr>
+    </w:lvl>
+    <w:lvl w:ilvl="7" w:tentative="1">
+      <w:start w:val="1"/>
+      <w:numFmt w:val="decimal"/>
+      <w:lvlText w:val="%8."/>
+      <w:lvlJc w:val="left"/>
+      <w:pPr>
+        <w:tabs>
+          <w:tab w:val="num" w:pos="5760"/>
+        </w:tabs>
+        <w:ind w:left="5760" w:hanging="360"/>
+      </w:pPr>
+    </w:lvl>
+    <w:lvl w:ilvl="8" w:tentative="1">
+      <w:start w:val="1"/>
+      <w:numFmt w:val="decimal"/>
+      <w:lvlText w:val="%9."/>
+      <w:lvlJc w:val="left"/>
+      <w:pPr>
+        <w:tabs>
+          <w:tab w:val="num" w:pos="6480"/>
+        </w:tabs>
+        <w:ind w:left="6480" w:hanging="360"/>
+      </w:pPr>
+    </w:lvl>
+  </w:abstractNum>
+  <w:abstractNum w:abstractNumId="6" w15:restartNumberingAfterBreak="0">
+    <w:nsid w:val="253D45A6"/>
+    <w:multiLevelType w:val="multilevel"/>
+    <w:tmpl w:val="75129B56"/>
+    <w:lvl w:ilvl="0">
+      <w:start w:val="6"/>
+      <w:numFmt w:val="decimal"/>
+      <w:lvlText w:val="%1."/>
+      <w:lvlJc w:val="left"/>
+      <w:pPr>
+        <w:tabs>
+          <w:tab w:val="num" w:pos="720"/>
+        </w:tabs>
+        <w:ind w:left="720" w:hanging="360"/>
+      </w:pPr>
+    </w:lvl>
+    <w:lvl w:ilvl="1" w:tentative="1">
+      <w:start w:val="1"/>
+      <w:numFmt w:val="decimal"/>
+      <w:lvlText w:val="%2."/>
+      <w:lvlJc w:val="left"/>
+      <w:pPr>
+        <w:tabs>
+          <w:tab w:val="num" w:pos="1440"/>
+        </w:tabs>
+        <w:ind w:left="1440" w:hanging="360"/>
+      </w:pPr>
+    </w:lvl>
+    <w:lvl w:ilvl="2" w:tentative="1">
+      <w:start w:val="1"/>
+      <w:numFmt w:val="decimal"/>
+      <w:lvlText w:val="%3."/>
+      <w:lvlJc w:val="left"/>
+      <w:pPr>
+        <w:tabs>
+          <w:tab w:val="num" w:pos="2160"/>
+        </w:tabs>
+        <w:ind w:left="2160" w:hanging="360"/>
+      </w:pPr>
+    </w:lvl>
+    <w:lvl w:ilvl="3" w:tentative="1">
+      <w:start w:val="1"/>
+      <w:numFmt w:val="decimal"/>
+      <w:lvlText w:val="%4."/>
+      <w:lvlJc w:val="left"/>
+      <w:pPr>
+        <w:tabs>
+          <w:tab w:val="num" w:pos="2880"/>
+        </w:tabs>
+        <w:ind w:left="2880" w:hanging="360"/>
+      </w:pPr>
+    </w:lvl>
+    <w:lvl w:ilvl="4" w:tentative="1">
+      <w:start w:val="1"/>
+      <w:numFmt w:val="decimal"/>
+      <w:lvlText w:val="%5."/>
+      <w:lvlJc w:val="left"/>
+      <w:pPr>
+        <w:tabs>
+          <w:tab w:val="num" w:pos="3600"/>
+        </w:tabs>
+        <w:ind w:left="3600" w:hanging="360"/>
+      </w:pPr>
+    </w:lvl>
+    <w:lvl w:ilvl="5" w:tentative="1">
+      <w:start w:val="1"/>
+      <w:numFmt w:val="decimal"/>
+      <w:lvlText w:val="%6."/>
+      <w:lvlJc w:val="left"/>
+      <w:pPr>
+        <w:tabs>
+          <w:tab w:val="num" w:pos="4320"/>
+        </w:tabs>
+        <w:ind w:left="4320" w:hanging="360"/>
+      </w:pPr>
+    </w:lvl>
+    <w:lvl w:ilvl="6" w:tentative="1">
+      <w:start w:val="1"/>
+      <w:numFmt w:val="decimal"/>
+      <w:lvlText w:val="%7."/>
+      <w:lvlJc w:val="left"/>
+      <w:pPr>
+        <w:tabs>
+          <w:tab w:val="num" w:pos="5040"/>
+        </w:tabs>
+        <w:ind w:left="5040" w:hanging="360"/>
+      </w:pPr>
+    </w:lvl>
+    <w:lvl w:ilvl="7" w:tentative="1">
+      <w:start w:val="1"/>
+      <w:numFmt w:val="decimal"/>
+      <w:lvlText w:val="%8."/>
+      <w:lvlJc w:val="left"/>
+      <w:pPr>
+        <w:tabs>
+          <w:tab w:val="num" w:pos="5760"/>
+        </w:tabs>
+        <w:ind w:left="5760" w:hanging="360"/>
+      </w:pPr>
+    </w:lvl>
+    <w:lvl w:ilvl="8" w:tentative="1">
+      <w:start w:val="1"/>
+      <w:numFmt w:val="decimal"/>
+      <w:lvlText w:val="%9."/>
+      <w:lvlJc w:val="left"/>
+      <w:pPr>
+        <w:tabs>
+          <w:tab w:val="num" w:pos="6480"/>
+        </w:tabs>
+        <w:ind w:left="6480" w:hanging="360"/>
+      </w:pPr>
+    </w:lvl>
+  </w:abstractNum>
+  <w:abstractNum w:abstractNumId="7" w15:restartNumberingAfterBreak="0">
     <w:nsid w:val="25F31B0F"/>
     <w:multiLevelType w:val="hybridMultilevel"/>
     <w:tmpl w:val="926CD14E"/>
@@ -20416,7 +21575,120 @@
       </w:rPr>
     </w:lvl>
   </w:abstractNum>
-  <w:abstractNum w:abstractNumId="1" w15:restartNumberingAfterBreak="0">
+  <w:abstractNum w:abstractNumId="8" w15:restartNumberingAfterBreak="0">
+    <w:nsid w:val="2CB72196"/>
+    <w:multiLevelType w:val="multilevel"/>
+    <w:tmpl w:val="6590E350"/>
+    <w:lvl w:ilvl="0">
+      <w:start w:val="15"/>
+      <w:numFmt w:val="decimal"/>
+      <w:lvlText w:val="%1."/>
+      <w:lvlJc w:val="left"/>
+      <w:pPr>
+        <w:tabs>
+          <w:tab w:val="num" w:pos="720"/>
+        </w:tabs>
+        <w:ind w:left="720" w:hanging="360"/>
+      </w:pPr>
+    </w:lvl>
+    <w:lvl w:ilvl="1" w:tentative="1">
+      <w:start w:val="1"/>
+      <w:numFmt w:val="decimal"/>
+      <w:lvlText w:val="%2."/>
+      <w:lvlJc w:val="left"/>
+      <w:pPr>
+        <w:tabs>
+          <w:tab w:val="num" w:pos="1440"/>
+        </w:tabs>
+        <w:ind w:left="1440" w:hanging="360"/>
+      </w:pPr>
+    </w:lvl>
+    <w:lvl w:ilvl="2" w:tentative="1">
+      <w:start w:val="1"/>
+      <w:numFmt w:val="decimal"/>
+      <w:lvlText w:val="%3."/>
+      <w:lvlJc w:val="left"/>
+      <w:pPr>
+        <w:tabs>
+          <w:tab w:val="num" w:pos="2160"/>
+        </w:tabs>
+        <w:ind w:left="2160" w:hanging="360"/>
+      </w:pPr>
+    </w:lvl>
+    <w:lvl w:ilvl="3" w:tentative="1">
+      <w:start w:val="1"/>
+      <w:numFmt w:val="decimal"/>
+      <w:lvlText w:val="%4."/>
+      <w:lvlJc w:val="left"/>
+      <w:pPr>
+        <w:tabs>
+          <w:tab w:val="num" w:pos="2880"/>
+        </w:tabs>
+        <w:ind w:left="2880" w:hanging="360"/>
+      </w:pPr>
+    </w:lvl>
+    <w:lvl w:ilvl="4" w:tentative="1">
+      <w:start w:val="1"/>
+      <w:numFmt w:val="decimal"/>
+      <w:lvlText w:val="%5."/>
+      <w:lvlJc w:val="left"/>
+      <w:pPr>
+        <w:tabs>
+          <w:tab w:val="num" w:pos="3600"/>
+        </w:tabs>
+        <w:ind w:left="3600" w:hanging="360"/>
+      </w:pPr>
+    </w:lvl>
+    <w:lvl w:ilvl="5" w:tentative="1">
+      <w:start w:val="1"/>
+      <w:numFmt w:val="decimal"/>
+      <w:lvlText w:val="%6."/>
+      <w:lvlJc w:val="left"/>
+      <w:pPr>
+        <w:tabs>
+          <w:tab w:val="num" w:pos="4320"/>
+        </w:tabs>
+        <w:ind w:left="4320" w:hanging="360"/>
+      </w:pPr>
+    </w:lvl>
+    <w:lvl w:ilvl="6" w:tentative="1">
+      <w:start w:val="1"/>
+      <w:numFmt w:val="decimal"/>
+      <w:lvlText w:val="%7."/>
+      <w:lvlJc w:val="left"/>
+      <w:pPr>
+        <w:tabs>
+          <w:tab w:val="num" w:pos="5040"/>
+        </w:tabs>
+        <w:ind w:left="5040" w:hanging="360"/>
+      </w:pPr>
+    </w:lvl>
+    <w:lvl w:ilvl="7" w:tentative="1">
+      <w:start w:val="1"/>
+      <w:numFmt w:val="decimal"/>
+      <w:lvlText w:val="%8."/>
+      <w:lvlJc w:val="left"/>
+      <w:pPr>
+        <w:tabs>
+          <w:tab w:val="num" w:pos="5760"/>
+        </w:tabs>
+        <w:ind w:left="5760" w:hanging="360"/>
+      </w:pPr>
+    </w:lvl>
+    <w:lvl w:ilvl="8" w:tentative="1">
+      <w:start w:val="1"/>
+      <w:numFmt w:val="decimal"/>
+      <w:lvlText w:val="%9."/>
+      <w:lvlJc w:val="left"/>
+      <w:pPr>
+        <w:tabs>
+          <w:tab w:val="num" w:pos="6480"/>
+        </w:tabs>
+        <w:ind w:left="6480" w:hanging="360"/>
+      </w:pPr>
+    </w:lvl>
+  </w:abstractNum>
+  <w:abstractNum w:abstractNumId="9" w15:restartNumberingAfterBreak="0">
     <w:nsid w:val="2E663624"/>
     <w:multiLevelType w:val="hybridMultilevel"/>
     <w:tmpl w:val="9ED6F4F2"/>
@@ -20529,7 +21801,7 @@
       </w:rPr>
     </w:lvl>
   </w:abstractNum>
-  <w:abstractNum w:abstractNumId="2" w15:restartNumberingAfterBreak="0">
+  <w:abstractNum w:abstractNumId="10" w15:restartNumberingAfterBreak="0">
     <w:nsid w:val="2F645906"/>
     <w:multiLevelType w:val="hybridMultilevel"/>
     <w:tmpl w:val="350442A8"/>
@@ -20619,197 +21891,801 @@
       </w:pPr>
     </w:lvl>
   </w:abstractNum>
+  <w:abstractNum w:abstractNumId="11" w15:restartNumberingAfterBreak="0">
+    <w:nsid w:val="39FC3C7E"/>
+    <w:multiLevelType w:val="multilevel"/>
+    <w:tmpl w:val="FCEECCCC"/>
+    <w:lvl w:ilvl="0">
+      <w:start w:val="10"/>
+      <w:numFmt w:val="decimal"/>
+      <w:lvlText w:val="%1."/>
+      <w:lvlJc w:val="left"/>
+      <w:pPr>
+        <w:tabs>
+          <w:tab w:val="num" w:pos="720"/>
+        </w:tabs>
+        <w:ind w:left="720" w:hanging="360"/>
+      </w:pPr>
+    </w:lvl>
+    <w:lvl w:ilvl="1" w:tentative="1">
+      <w:start w:val="1"/>
+      <w:numFmt w:val="decimal"/>
+      <w:lvlText w:val="%2."/>
+      <w:lvlJc w:val="left"/>
+      <w:pPr>
+        <w:tabs>
+          <w:tab w:val="num" w:pos="1440"/>
+        </w:tabs>
+        <w:ind w:left="1440" w:hanging="360"/>
+      </w:pPr>
+    </w:lvl>
+    <w:lvl w:ilvl="2" w:tentative="1">
+      <w:start w:val="1"/>
+      <w:numFmt w:val="decimal"/>
+      <w:lvlText w:val="%3."/>
+      <w:lvlJc w:val="left"/>
+      <w:pPr>
+        <w:tabs>
+          <w:tab w:val="num" w:pos="2160"/>
+        </w:tabs>
+        <w:ind w:left="2160" w:hanging="360"/>
+      </w:pPr>
+    </w:lvl>
+    <w:lvl w:ilvl="3" w:tentative="1">
+      <w:start w:val="1"/>
+      <w:numFmt w:val="decimal"/>
+      <w:lvlText w:val="%4."/>
+      <w:lvlJc w:val="left"/>
+      <w:pPr>
+        <w:tabs>
+          <w:tab w:val="num" w:pos="2880"/>
+        </w:tabs>
+        <w:ind w:left="2880" w:hanging="360"/>
+      </w:pPr>
+    </w:lvl>
+    <w:lvl w:ilvl="4" w:tentative="1">
+      <w:start w:val="1"/>
+      <w:numFmt w:val="decimal"/>
+      <w:lvlText w:val="%5."/>
+      <w:lvlJc w:val="left"/>
+      <w:pPr>
+        <w:tabs>
+          <w:tab w:val="num" w:pos="3600"/>
+        </w:tabs>
+        <w:ind w:left="3600" w:hanging="360"/>
+      </w:pPr>
+    </w:lvl>
+    <w:lvl w:ilvl="5" w:tentative="1">
+      <w:start w:val="1"/>
+      <w:numFmt w:val="decimal"/>
+      <w:lvlText w:val="%6."/>
+      <w:lvlJc w:val="left"/>
+      <w:pPr>
+        <w:tabs>
+          <w:tab w:val="num" w:pos="4320"/>
+        </w:tabs>
+        <w:ind w:left="4320" w:hanging="360"/>
+      </w:pPr>
+    </w:lvl>
+    <w:lvl w:ilvl="6" w:tentative="1">
+      <w:start w:val="1"/>
+      <w:numFmt w:val="decimal"/>
+      <w:lvlText w:val="%7."/>
+      <w:lvlJc w:val="left"/>
+      <w:pPr>
+        <w:tabs>
+          <w:tab w:val="num" w:pos="5040"/>
+        </w:tabs>
+        <w:ind w:left="5040" w:hanging="360"/>
+      </w:pPr>
+    </w:lvl>
+    <w:lvl w:ilvl="7" w:tentative="1">
+      <w:start w:val="1"/>
+      <w:numFmt w:val="decimal"/>
+      <w:lvlText w:val="%8."/>
+      <w:lvlJc w:val="left"/>
+      <w:pPr>
+        <w:tabs>
+          <w:tab w:val="num" w:pos="5760"/>
+        </w:tabs>
+        <w:ind w:left="5760" w:hanging="360"/>
+      </w:pPr>
+    </w:lvl>
+    <w:lvl w:ilvl="8" w:tentative="1">
+      <w:start w:val="1"/>
+      <w:numFmt w:val="decimal"/>
+      <w:lvlText w:val="%9."/>
+      <w:lvlJc w:val="left"/>
+      <w:pPr>
+        <w:tabs>
+          <w:tab w:val="num" w:pos="6480"/>
+        </w:tabs>
+        <w:ind w:left="6480" w:hanging="360"/>
+      </w:pPr>
+    </w:lvl>
+  </w:abstractNum>
+  <w:abstractNum w:abstractNumId="12" w15:restartNumberingAfterBreak="0">
+    <w:nsid w:val="468E7AE0"/>
+    <w:multiLevelType w:val="multilevel"/>
+    <w:tmpl w:val="55BC6DAA"/>
+    <w:lvl w:ilvl="0">
+      <w:start w:val="3"/>
+      <w:numFmt w:val="decimal"/>
+      <w:lvlText w:val="%1."/>
+      <w:lvlJc w:val="left"/>
+      <w:pPr>
+        <w:tabs>
+          <w:tab w:val="num" w:pos="720"/>
+        </w:tabs>
+        <w:ind w:left="720" w:hanging="360"/>
+      </w:pPr>
+    </w:lvl>
+    <w:lvl w:ilvl="1" w:tentative="1">
+      <w:start w:val="1"/>
+      <w:numFmt w:val="decimal"/>
+      <w:lvlText w:val="%2."/>
+      <w:lvlJc w:val="left"/>
+      <w:pPr>
+        <w:tabs>
+          <w:tab w:val="num" w:pos="1440"/>
+        </w:tabs>
+        <w:ind w:left="1440" w:hanging="360"/>
+      </w:pPr>
+    </w:lvl>
+    <w:lvl w:ilvl="2" w:tentative="1">
+      <w:start w:val="1"/>
+      <w:numFmt w:val="decimal"/>
+      <w:lvlText w:val="%3."/>
+      <w:lvlJc w:val="left"/>
+      <w:pPr>
+        <w:tabs>
+          <w:tab w:val="num" w:pos="2160"/>
+        </w:tabs>
+        <w:ind w:left="2160" w:hanging="360"/>
+      </w:pPr>
+    </w:lvl>
+    <w:lvl w:ilvl="3" w:tentative="1">
+      <w:start w:val="1"/>
+      <w:numFmt w:val="decimal"/>
+      <w:lvlText w:val="%4."/>
+      <w:lvlJc w:val="left"/>
+      <w:pPr>
+        <w:tabs>
+          <w:tab w:val="num" w:pos="2880"/>
+        </w:tabs>
+        <w:ind w:left="2880" w:hanging="360"/>
+      </w:pPr>
+    </w:lvl>
+    <w:lvl w:ilvl="4" w:tentative="1">
+      <w:start w:val="1"/>
+      <w:numFmt w:val="decimal"/>
+      <w:lvlText w:val="%5."/>
+      <w:lvlJc w:val="left"/>
+      <w:pPr>
+        <w:tabs>
+          <w:tab w:val="num" w:pos="3600"/>
+        </w:tabs>
+        <w:ind w:left="3600" w:hanging="360"/>
+      </w:pPr>
+    </w:lvl>
+    <w:lvl w:ilvl="5" w:tentative="1">
+      <w:start w:val="1"/>
+      <w:numFmt w:val="decimal"/>
+      <w:lvlText w:val="%6."/>
+      <w:lvlJc w:val="left"/>
+      <w:pPr>
+        <w:tabs>
+          <w:tab w:val="num" w:pos="4320"/>
+        </w:tabs>
+        <w:ind w:left="4320" w:hanging="360"/>
+      </w:pPr>
+    </w:lvl>
+    <w:lvl w:ilvl="6" w:tentative="1">
+      <w:start w:val="1"/>
+      <w:numFmt w:val="decimal"/>
+      <w:lvlText w:val="%7."/>
+      <w:lvlJc w:val="left"/>
+      <w:pPr>
+        <w:tabs>
+          <w:tab w:val="num" w:pos="5040"/>
+        </w:tabs>
+        <w:ind w:left="5040" w:hanging="360"/>
+      </w:pPr>
+    </w:lvl>
+    <w:lvl w:ilvl="7" w:tentative="1">
+      <w:start w:val="1"/>
+      <w:numFmt w:val="decimal"/>
+      <w:lvlText w:val="%8."/>
+      <w:lvlJc w:val="left"/>
+      <w:pPr>
+        <w:tabs>
+          <w:tab w:val="num" w:pos="5760"/>
+        </w:tabs>
+        <w:ind w:left="5760" w:hanging="360"/>
+      </w:pPr>
+    </w:lvl>
+    <w:lvl w:ilvl="8" w:tentative="1">
+      <w:start w:val="1"/>
+      <w:numFmt w:val="decimal"/>
+      <w:lvlText w:val="%9."/>
+      <w:lvlJc w:val="left"/>
+      <w:pPr>
+        <w:tabs>
+          <w:tab w:val="num" w:pos="6480"/>
+        </w:tabs>
+        <w:ind w:left="6480" w:hanging="360"/>
+      </w:pPr>
+    </w:lvl>
+  </w:abstractNum>
+  <w:abstractNum w:abstractNumId="13" w15:restartNumberingAfterBreak="0">
+    <w:nsid w:val="6C792398"/>
+    <w:multiLevelType w:val="multilevel"/>
+    <w:tmpl w:val="561E4A30"/>
+    <w:lvl w:ilvl="0">
+      <w:start w:val="13"/>
+      <w:numFmt w:val="decimal"/>
+      <w:lvlText w:val="%1."/>
+      <w:lvlJc w:val="left"/>
+      <w:pPr>
+        <w:tabs>
+          <w:tab w:val="num" w:pos="720"/>
+        </w:tabs>
+        <w:ind w:left="720" w:hanging="360"/>
+      </w:pPr>
+    </w:lvl>
+    <w:lvl w:ilvl="1" w:tentative="1">
+      <w:start w:val="1"/>
+      <w:numFmt w:val="decimal"/>
+      <w:lvlText w:val="%2."/>
+      <w:lvlJc w:val="left"/>
+      <w:pPr>
+        <w:tabs>
+          <w:tab w:val="num" w:pos="1440"/>
+        </w:tabs>
+        <w:ind w:left="1440" w:hanging="360"/>
+      </w:pPr>
+    </w:lvl>
+    <w:lvl w:ilvl="2" w:tentative="1">
+      <w:start w:val="1"/>
+      <w:numFmt w:val="decimal"/>
+      <w:lvlText w:val="%3."/>
+      <w:lvlJc w:val="left"/>
+      <w:pPr>
+        <w:tabs>
+          <w:tab w:val="num" w:pos="2160"/>
+        </w:tabs>
+        <w:ind w:left="2160" w:hanging="360"/>
+      </w:pPr>
+    </w:lvl>
+    <w:lvl w:ilvl="3" w:tentative="1">
+      <w:start w:val="1"/>
+      <w:numFmt w:val="decimal"/>
+      <w:lvlText w:val="%4."/>
+      <w:lvlJc w:val="left"/>
+      <w:pPr>
+        <w:tabs>
+          <w:tab w:val="num" w:pos="2880"/>
+        </w:tabs>
+        <w:ind w:left="2880" w:hanging="360"/>
+      </w:pPr>
+    </w:lvl>
+    <w:lvl w:ilvl="4" w:tentative="1">
+      <w:start w:val="1"/>
+      <w:numFmt w:val="decimal"/>
+      <w:lvlText w:val="%5."/>
+      <w:lvlJc w:val="left"/>
+      <w:pPr>
+        <w:tabs>
+          <w:tab w:val="num" w:pos="3600"/>
+        </w:tabs>
+        <w:ind w:left="3600" w:hanging="360"/>
+      </w:pPr>
+    </w:lvl>
+    <w:lvl w:ilvl="5" w:tentative="1">
+      <w:start w:val="1"/>
+      <w:numFmt w:val="decimal"/>
+      <w:lvlText w:val="%6."/>
+      <w:lvlJc w:val="left"/>
+      <w:pPr>
+        <w:tabs>
+          <w:tab w:val="num" w:pos="4320"/>
+        </w:tabs>
+        <w:ind w:left="4320" w:hanging="360"/>
+      </w:pPr>
+    </w:lvl>
+    <w:lvl w:ilvl="6" w:tentative="1">
+      <w:start w:val="1"/>
+      <w:numFmt w:val="decimal"/>
+      <w:lvlText w:val="%7."/>
+      <w:lvlJc w:val="left"/>
+      <w:pPr>
+        <w:tabs>
+          <w:tab w:val="num" w:pos="5040"/>
+        </w:tabs>
+        <w:ind w:left="5040" w:hanging="360"/>
+      </w:pPr>
+    </w:lvl>
+    <w:lvl w:ilvl="7" w:tentative="1">
+      <w:start w:val="1"/>
+      <w:numFmt w:val="decimal"/>
+      <w:lvlText w:val="%8."/>
+      <w:lvlJc w:val="left"/>
+      <w:pPr>
+        <w:tabs>
+          <w:tab w:val="num" w:pos="5760"/>
+        </w:tabs>
+        <w:ind w:left="5760" w:hanging="360"/>
+      </w:pPr>
+    </w:lvl>
+    <w:lvl w:ilvl="8" w:tentative="1">
+      <w:start w:val="1"/>
+      <w:numFmt w:val="decimal"/>
+      <w:lvlText w:val="%9."/>
+      <w:lvlJc w:val="left"/>
+      <w:pPr>
+        <w:tabs>
+          <w:tab w:val="num" w:pos="6480"/>
+        </w:tabs>
+        <w:ind w:left="6480" w:hanging="360"/>
+      </w:pPr>
+    </w:lvl>
+  </w:abstractNum>
+  <w:abstractNum w:abstractNumId="14" w15:restartNumberingAfterBreak="0">
+    <w:nsid w:val="6D9A6E41"/>
+    <w:multiLevelType w:val="multilevel"/>
+    <w:tmpl w:val="FFB8E8B4"/>
+    <w:lvl w:ilvl="0">
+      <w:start w:val="14"/>
+      <w:numFmt w:val="decimal"/>
+      <w:lvlText w:val="%1."/>
+      <w:lvlJc w:val="left"/>
+      <w:pPr>
+        <w:tabs>
+          <w:tab w:val="num" w:pos="720"/>
+        </w:tabs>
+        <w:ind w:left="720" w:hanging="360"/>
+      </w:pPr>
+    </w:lvl>
+    <w:lvl w:ilvl="1" w:tentative="1">
+      <w:start w:val="1"/>
+      <w:numFmt w:val="decimal"/>
+      <w:lvlText w:val="%2."/>
+      <w:lvlJc w:val="left"/>
+      <w:pPr>
+        <w:tabs>
+          <w:tab w:val="num" w:pos="1440"/>
+        </w:tabs>
+        <w:ind w:left="1440" w:hanging="360"/>
+      </w:pPr>
+    </w:lvl>
+    <w:lvl w:ilvl="2" w:tentative="1">
+      <w:start w:val="1"/>
+      <w:numFmt w:val="decimal"/>
+      <w:lvlText w:val="%3."/>
+      <w:lvlJc w:val="left"/>
+      <w:pPr>
+        <w:tabs>
+          <w:tab w:val="num" w:pos="2160"/>
+        </w:tabs>
+        <w:ind w:left="2160" w:hanging="360"/>
+      </w:pPr>
+    </w:lvl>
+    <w:lvl w:ilvl="3" w:tentative="1">
+      <w:start w:val="1"/>
+      <w:numFmt w:val="decimal"/>
+      <w:lvlText w:val="%4."/>
+      <w:lvlJc w:val="left"/>
+      <w:pPr>
+        <w:tabs>
+          <w:tab w:val="num" w:pos="2880"/>
+        </w:tabs>
+        <w:ind w:left="2880" w:hanging="360"/>
+      </w:pPr>
+    </w:lvl>
+    <w:lvl w:ilvl="4" w:tentative="1">
+      <w:start w:val="1"/>
+      <w:numFmt w:val="decimal"/>
+      <w:lvlText w:val="%5."/>
+      <w:lvlJc w:val="left"/>
+      <w:pPr>
+        <w:tabs>
+          <w:tab w:val="num" w:pos="3600"/>
+        </w:tabs>
+        <w:ind w:left="3600" w:hanging="360"/>
+      </w:pPr>
+    </w:lvl>
+    <w:lvl w:ilvl="5" w:tentative="1">
+      <w:start w:val="1"/>
+      <w:numFmt w:val="decimal"/>
+      <w:lvlText w:val="%6."/>
+      <w:lvlJc w:val="left"/>
+      <w:pPr>
+        <w:tabs>
+          <w:tab w:val="num" w:pos="4320"/>
+        </w:tabs>
+        <w:ind w:left="4320" w:hanging="360"/>
+      </w:pPr>
+    </w:lvl>
+    <w:lvl w:ilvl="6" w:tentative="1">
+      <w:start w:val="1"/>
+      <w:numFmt w:val="decimal"/>
+      <w:lvlText w:val="%7."/>
+      <w:lvlJc w:val="left"/>
+      <w:pPr>
+        <w:tabs>
+          <w:tab w:val="num" w:pos="5040"/>
+        </w:tabs>
+        <w:ind w:left="5040" w:hanging="360"/>
+      </w:pPr>
+    </w:lvl>
+    <w:lvl w:ilvl="7" w:tentative="1">
+      <w:start w:val="1"/>
+      <w:numFmt w:val="decimal"/>
+      <w:lvlText w:val="%8."/>
+      <w:lvlJc w:val="left"/>
+      <w:pPr>
+        <w:tabs>
+          <w:tab w:val="num" w:pos="5760"/>
+        </w:tabs>
+        <w:ind w:left="5760" w:hanging="360"/>
+      </w:pPr>
+    </w:lvl>
+    <w:lvl w:ilvl="8" w:tentative="1">
+      <w:start w:val="1"/>
+      <w:numFmt w:val="decimal"/>
+      <w:lvlText w:val="%9."/>
+      <w:lvlJc w:val="left"/>
+      <w:pPr>
+        <w:tabs>
+          <w:tab w:val="num" w:pos="6480"/>
+        </w:tabs>
+        <w:ind w:left="6480" w:hanging="360"/>
+      </w:pPr>
+    </w:lvl>
+  </w:abstractNum>
+  <w:abstractNum w:abstractNumId="15" w15:restartNumberingAfterBreak="0">
+    <w:nsid w:val="77780038"/>
+    <w:multiLevelType w:val="multilevel"/>
+    <w:tmpl w:val="136A415A"/>
+    <w:lvl w:ilvl="0">
+      <w:start w:val="8"/>
+      <w:numFmt w:val="decimal"/>
+      <w:lvlText w:val="%1."/>
+      <w:lvlJc w:val="left"/>
+      <w:pPr>
+        <w:tabs>
+          <w:tab w:val="num" w:pos="720"/>
+        </w:tabs>
+        <w:ind w:left="720" w:hanging="360"/>
+      </w:pPr>
+    </w:lvl>
+    <w:lvl w:ilvl="1" w:tentative="1">
+      <w:start w:val="1"/>
+      <w:numFmt w:val="decimal"/>
+      <w:lvlText w:val="%2."/>
+      <w:lvlJc w:val="left"/>
+      <w:pPr>
+        <w:tabs>
+          <w:tab w:val="num" w:pos="1440"/>
+        </w:tabs>
+        <w:ind w:left="1440" w:hanging="360"/>
+      </w:pPr>
+    </w:lvl>
+    <w:lvl w:ilvl="2" w:tentative="1">
+      <w:start w:val="1"/>
+      <w:numFmt w:val="decimal"/>
+      <w:lvlText w:val="%3."/>
+      <w:lvlJc w:val="left"/>
+      <w:pPr>
+        <w:tabs>
+          <w:tab w:val="num" w:pos="2160"/>
+        </w:tabs>
+        <w:ind w:left="2160" w:hanging="360"/>
+      </w:pPr>
+    </w:lvl>
+    <w:lvl w:ilvl="3" w:tentative="1">
+      <w:start w:val="1"/>
+      <w:numFmt w:val="decimal"/>
+      <w:lvlText w:val="%4."/>
+      <w:lvlJc w:val="left"/>
+      <w:pPr>
+        <w:tabs>
+          <w:tab w:val="num" w:pos="2880"/>
+        </w:tabs>
+        <w:ind w:left="2880" w:hanging="360"/>
+      </w:pPr>
+    </w:lvl>
+    <w:lvl w:ilvl="4" w:tentative="1">
+      <w:start w:val="1"/>
+      <w:numFmt w:val="decimal"/>
+      <w:lvlText w:val="%5."/>
+      <w:lvlJc w:val="left"/>
+      <w:pPr>
+        <w:tabs>
+          <w:tab w:val="num" w:pos="3600"/>
+        </w:tabs>
+        <w:ind w:left="3600" w:hanging="360"/>
+      </w:pPr>
+    </w:lvl>
+    <w:lvl w:ilvl="5" w:tentative="1">
+      <w:start w:val="1"/>
+      <w:numFmt w:val="decimal"/>
+      <w:lvlText w:val="%6."/>
+      <w:lvlJc w:val="left"/>
+      <w:pPr>
+        <w:tabs>
+          <w:tab w:val="num" w:pos="4320"/>
+        </w:tabs>
+        <w:ind w:left="4320" w:hanging="360"/>
+      </w:pPr>
+    </w:lvl>
+    <w:lvl w:ilvl="6" w:tentative="1">
+      <w:start w:val="1"/>
+      <w:numFmt w:val="decimal"/>
+      <w:lvlText w:val="%7."/>
+      <w:lvlJc w:val="left"/>
+      <w:pPr>
+        <w:tabs>
+          <w:tab w:val="num" w:pos="5040"/>
+        </w:tabs>
+        <w:ind w:left="5040" w:hanging="360"/>
+      </w:pPr>
+    </w:lvl>
+    <w:lvl w:ilvl="7" w:tentative="1">
+      <w:start w:val="1"/>
+      <w:numFmt w:val="decimal"/>
+      <w:lvlText w:val="%8."/>
+      <w:lvlJc w:val="left"/>
+      <w:pPr>
+        <w:tabs>
+          <w:tab w:val="num" w:pos="5760"/>
+        </w:tabs>
+        <w:ind w:left="5760" w:hanging="360"/>
+      </w:pPr>
+    </w:lvl>
+    <w:lvl w:ilvl="8" w:tentative="1">
+      <w:start w:val="1"/>
+      <w:numFmt w:val="decimal"/>
+      <w:lvlText w:val="%9."/>
+      <w:lvlJc w:val="left"/>
+      <w:pPr>
+        <w:tabs>
+          <w:tab w:val="num" w:pos="6480"/>
+        </w:tabs>
+        <w:ind w:left="6480" w:hanging="360"/>
+      </w:pPr>
+    </w:lvl>
+  </w:abstractNum>
   <w:num w:numId="1" w16cid:durableId="449710722">
-    <w:abstractNumId w:val="2"/>
+    <w:abstractNumId w:val="10"/>
   </w:num>
   <w:num w:numId="2" w16cid:durableId="420295896">
-    <w:abstractNumId w:val="1"/>
+    <w:abstractNumId w:val="9"/>
   </w:num>
   <w:num w:numId="3" w16cid:durableId="1299140080">
-    <w:abstractNumId w:val="2"/>
+    <w:abstractNumId w:val="10"/>
   </w:num>
   <w:num w:numId="4" w16cid:durableId="1780567003">
-    <w:abstractNumId w:val="2"/>
+    <w:abstractNumId w:val="10"/>
     <w:lvlOverride w:ilvl="0">
       <w:startOverride w:val="1"/>
     </w:lvlOverride>
   </w:num>
   <w:num w:numId="5" w16cid:durableId="1115295402">
-    <w:abstractNumId w:val="2"/>
+    <w:abstractNumId w:val="10"/>
     <w:lvlOverride w:ilvl="0">
       <w:startOverride w:val="1"/>
     </w:lvlOverride>
   </w:num>
   <w:num w:numId="6" w16cid:durableId="1050836918">
-    <w:abstractNumId w:val="2"/>
+    <w:abstractNumId w:val="10"/>
     <w:lvlOverride w:ilvl="0">
       <w:startOverride w:val="1"/>
     </w:lvlOverride>
   </w:num>
   <w:num w:numId="7" w16cid:durableId="50153077">
-    <w:abstractNumId w:val="2"/>
+    <w:abstractNumId w:val="10"/>
     <w:lvlOverride w:ilvl="0">
       <w:startOverride w:val="1"/>
     </w:lvlOverride>
   </w:num>
   <w:num w:numId="8" w16cid:durableId="1541816617">
-    <w:abstractNumId w:val="2"/>
+    <w:abstractNumId w:val="10"/>
     <w:lvlOverride w:ilvl="0">
       <w:startOverride w:val="1"/>
     </w:lvlOverride>
   </w:num>
   <w:num w:numId="9" w16cid:durableId="768547745">
-    <w:abstractNumId w:val="2"/>
+    <w:abstractNumId w:val="10"/>
     <w:lvlOverride w:ilvl="0">
       <w:startOverride w:val="1"/>
     </w:lvlOverride>
   </w:num>
   <w:num w:numId="10" w16cid:durableId="1488284551">
-    <w:abstractNumId w:val="2"/>
+    <w:abstractNumId w:val="10"/>
     <w:lvlOverride w:ilvl="0">
       <w:startOverride w:val="1"/>
     </w:lvlOverride>
   </w:num>
   <w:num w:numId="11" w16cid:durableId="969897534">
-    <w:abstractNumId w:val="2"/>
+    <w:abstractNumId w:val="10"/>
     <w:lvlOverride w:ilvl="0">
       <w:startOverride w:val="1"/>
     </w:lvlOverride>
   </w:num>
   <w:num w:numId="12" w16cid:durableId="453719167">
-    <w:abstractNumId w:val="2"/>
+    <w:abstractNumId w:val="10"/>
     <w:lvlOverride w:ilvl="0">
       <w:startOverride w:val="1"/>
     </w:lvlOverride>
   </w:num>
   <w:num w:numId="13" w16cid:durableId="1361512535">
-    <w:abstractNumId w:val="2"/>
+    <w:abstractNumId w:val="10"/>
     <w:lvlOverride w:ilvl="0">
       <w:startOverride w:val="1"/>
     </w:lvlOverride>
   </w:num>
   <w:num w:numId="14" w16cid:durableId="1396469315">
-    <w:abstractNumId w:val="2"/>
+    <w:abstractNumId w:val="10"/>
     <w:lvlOverride w:ilvl="0">
       <w:startOverride w:val="1"/>
     </w:lvlOverride>
   </w:num>
   <w:num w:numId="15" w16cid:durableId="1181696564">
-    <w:abstractNumId w:val="2"/>
+    <w:abstractNumId w:val="10"/>
     <w:lvlOverride w:ilvl="0">
       <w:startOverride w:val="1"/>
     </w:lvlOverride>
   </w:num>
   <w:num w:numId="16" w16cid:durableId="1900095336">
-    <w:abstractNumId w:val="2"/>
+    <w:abstractNumId w:val="10"/>
     <w:lvlOverride w:ilvl="0">
       <w:startOverride w:val="1"/>
     </w:lvlOverride>
   </w:num>
   <w:num w:numId="17" w16cid:durableId="728380487">
-    <w:abstractNumId w:val="2"/>
+    <w:abstractNumId w:val="10"/>
     <w:lvlOverride w:ilvl="0">
       <w:startOverride w:val="1"/>
     </w:lvlOverride>
   </w:num>
   <w:num w:numId="18" w16cid:durableId="957561786">
-    <w:abstractNumId w:val="2"/>
+    <w:abstractNumId w:val="10"/>
     <w:lvlOverride w:ilvl="0">
       <w:startOverride w:val="1"/>
     </w:lvlOverride>
   </w:num>
   <w:num w:numId="19" w16cid:durableId="1098797546">
-    <w:abstractNumId w:val="2"/>
+    <w:abstractNumId w:val="10"/>
     <w:lvlOverride w:ilvl="0">
       <w:startOverride w:val="1"/>
     </w:lvlOverride>
   </w:num>
   <w:num w:numId="20" w16cid:durableId="1755123817">
-    <w:abstractNumId w:val="2"/>
+    <w:abstractNumId w:val="10"/>
     <w:lvlOverride w:ilvl="0">
       <w:startOverride w:val="1"/>
     </w:lvlOverride>
   </w:num>
   <w:num w:numId="21" w16cid:durableId="1991128083">
-    <w:abstractNumId w:val="2"/>
+    <w:abstractNumId w:val="10"/>
     <w:lvlOverride w:ilvl="0">
       <w:startOverride w:val="1"/>
     </w:lvlOverride>
   </w:num>
   <w:num w:numId="22" w16cid:durableId="345324343">
-    <w:abstractNumId w:val="2"/>
+    <w:abstractNumId w:val="10"/>
     <w:lvlOverride w:ilvl="0">
       <w:startOverride w:val="1"/>
     </w:lvlOverride>
   </w:num>
   <w:num w:numId="23" w16cid:durableId="1255549416">
-    <w:abstractNumId w:val="2"/>
+    <w:abstractNumId w:val="10"/>
     <w:lvlOverride w:ilvl="0">
       <w:startOverride w:val="1"/>
     </w:lvlOverride>
   </w:num>
   <w:num w:numId="24" w16cid:durableId="495075091">
-    <w:abstractNumId w:val="2"/>
+    <w:abstractNumId w:val="10"/>
     <w:lvlOverride w:ilvl="0">
       <w:startOverride w:val="1"/>
     </w:lvlOverride>
   </w:num>
   <w:num w:numId="25" w16cid:durableId="2067491833">
-    <w:abstractNumId w:val="2"/>
+    <w:abstractNumId w:val="10"/>
     <w:lvlOverride w:ilvl="0">
       <w:startOverride w:val="1"/>
     </w:lvlOverride>
   </w:num>
   <w:num w:numId="26" w16cid:durableId="656222890">
-    <w:abstractNumId w:val="2"/>
+    <w:abstractNumId w:val="10"/>
     <w:lvlOverride w:ilvl="0">
       <w:startOverride w:val="1"/>
     </w:lvlOverride>
   </w:num>
   <w:num w:numId="27" w16cid:durableId="1142042712">
-    <w:abstractNumId w:val="2"/>
+    <w:abstractNumId w:val="10"/>
     <w:lvlOverride w:ilvl="0">
       <w:startOverride w:val="1"/>
     </w:lvlOverride>
   </w:num>
   <w:num w:numId="28" w16cid:durableId="1614242953">
-    <w:abstractNumId w:val="0"/>
+    <w:abstractNumId w:val="7"/>
   </w:num>
   <w:num w:numId="29" w16cid:durableId="286395791">
-    <w:abstractNumId w:val="2"/>
+    <w:abstractNumId w:val="10"/>
     <w:lvlOverride w:ilvl="0">
       <w:startOverride w:val="1"/>
     </w:lvlOverride>
   </w:num>
   <w:num w:numId="30" w16cid:durableId="1722750676">
-    <w:abstractNumId w:val="2"/>
+    <w:abstractNumId w:val="10"/>
     <w:lvlOverride w:ilvl="0">
       <w:startOverride w:val="1"/>
     </w:lvlOverride>
   </w:num>
   <w:num w:numId="31" w16cid:durableId="1007706958">
-    <w:abstractNumId w:val="2"/>
+    <w:abstractNumId w:val="10"/>
     <w:lvlOverride w:ilvl="0">
       <w:startOverride w:val="1"/>
     </w:lvlOverride>
   </w:num>
   <w:num w:numId="32" w16cid:durableId="156387336">
-    <w:abstractNumId w:val="2"/>
+    <w:abstractNumId w:val="10"/>
     <w:lvlOverride w:ilvl="0">
       <w:startOverride w:val="1"/>
     </w:lvlOverride>
   </w:num>
   <w:num w:numId="33" w16cid:durableId="1948342637">
-    <w:abstractNumId w:val="2"/>
+    <w:abstractNumId w:val="10"/>
     <w:lvlOverride w:ilvl="0">
       <w:startOverride w:val="1"/>
     </w:lvlOverride>
   </w:num>
   <w:num w:numId="34" w16cid:durableId="392896904">
-    <w:abstractNumId w:val="2"/>
+    <w:abstractNumId w:val="10"/>
     <w:lvlOverride w:ilvl="0">
       <w:startOverride w:val="1"/>
     </w:lvlOverride>
+  </w:num>
+  <w:num w:numId="35" w16cid:durableId="1424305051">
+    <w:abstractNumId w:val="12"/>
+  </w:num>
+  <w:num w:numId="36" w16cid:durableId="1438015789">
+    <w:abstractNumId w:val="2"/>
+  </w:num>
+  <w:num w:numId="37" w16cid:durableId="61100282">
+    <w:abstractNumId w:val="0"/>
+  </w:num>
+  <w:num w:numId="38" w16cid:durableId="1156069693">
+    <w:abstractNumId w:val="15"/>
+  </w:num>
+  <w:num w:numId="39" w16cid:durableId="721443055">
+    <w:abstractNumId w:val="4"/>
+  </w:num>
+  <w:num w:numId="40" w16cid:durableId="1079447647">
+    <w:abstractNumId w:val="13"/>
+  </w:num>
+  <w:num w:numId="41" w16cid:durableId="1885017963">
+    <w:abstractNumId w:val="14"/>
+  </w:num>
+  <w:num w:numId="42" w16cid:durableId="91627932">
+    <w:abstractNumId w:val="8"/>
+  </w:num>
+  <w:num w:numId="43" w16cid:durableId="2043548767">
+    <w:abstractNumId w:val="3"/>
+  </w:num>
+  <w:num w:numId="44" w16cid:durableId="1697851696">
+    <w:abstractNumId w:val="6"/>
+  </w:num>
+  <w:num w:numId="45" w16cid:durableId="2124416879">
+    <w:abstractNumId w:val="5"/>
+  </w:num>
+  <w:num w:numId="46" w16cid:durableId="542524316">
+    <w:abstractNumId w:val="11"/>
+  </w:num>
+  <w:num w:numId="47" w16cid:durableId="927345570">
+    <w:abstractNumId w:val="1"/>
   </w:num>
   <w:numIdMacAtCleanup w:val="30"/>
 </w:numbering>

</xml_diff>